<commit_message>
docs: manuals updated for Auto-fill, Remove file, KII interview link
Co-Authored-By: Claude Sonnet 5 <noreply@anthropic.com>
</commit_message>
<xml_diff>
--- a/docs/manuals/RA_Training_Programme_and_Facilitator_Guide.docx
+++ b/docs/manuals/RA_Training_Programme_and_Facilitator_Guide.docx
@@ -469,7 +469,7 @@
                 <w:sz w:val="19"/>
                 <w:szCs w:val="19"/>
               </w:rPr>
-              <w:t>Version 1.0 · 15 September 2026</w:t>
+              <w:t>Version 1.1 · 19 September 2026</w:t>
             </w:r>
           </w:p>
         </w:tc>
@@ -538,7 +538,7 @@
     <w:sdt>
       <w:sdtPr>
         <w:alias w:val="Contents"/>
-        <w:id w:val="-494958420"/>
+        <w:id w:val="-428742970"/>
       </w:sdtPr>
       <w:sdtEndPr/>
       <w:sdtContent>
@@ -567,7 +567,7 @@
           <w:r>
             <w:fldChar w:fldCharType="separate"/>
           </w:r>
-          <w:hyperlink w:anchor="_Toc240466335" w:history="1">
+          <w:hyperlink w:anchor="_Toc240713051" w:history="1">
             <w:r>
               <w:rPr>
                 <w:rStyle w:val="Hyperlink"/>
@@ -591,7 +591,7 @@
               <w:rPr>
                 <w:noProof/>
               </w:rPr>
-              <w:instrText xml:space="preserve"> PAGEREF _Toc240466335 \h </w:instrText>
+              <w:instrText xml:space="preserve"> PAGEREF _Toc240713051 \h </w:instrText>
             </w:r>
             <w:r>
               <w:rPr>
@@ -634,7 +634,7 @@
               <w14:ligatures w14:val="standardContextual"/>
             </w:rPr>
           </w:pPr>
-          <w:hyperlink w:anchor="_Toc240466336" w:history="1">
+          <w:hyperlink w:anchor="_Toc240713052" w:history="1">
             <w:r>
               <w:rPr>
                 <w:rStyle w:val="Hyperlink"/>
@@ -658,7 +658,7 @@
               <w:rPr>
                 <w:noProof/>
               </w:rPr>
-              <w:instrText xml:space="preserve"> PAGEREF _Toc240466336 \h </w:instrText>
+              <w:instrText xml:space="preserve"> PAGEREF _Toc240713052 \h </w:instrText>
             </w:r>
             <w:r>
               <w:rPr>
@@ -701,7 +701,7 @@
               <w14:ligatures w14:val="standardContextual"/>
             </w:rPr>
           </w:pPr>
-          <w:hyperlink w:anchor="_Toc240466337" w:history="1">
+          <w:hyperlink w:anchor="_Toc240713053" w:history="1">
             <w:r>
               <w:rPr>
                 <w:rStyle w:val="Hyperlink"/>
@@ -725,7 +725,7 @@
               <w:rPr>
                 <w:noProof/>
               </w:rPr>
-              <w:instrText xml:space="preserve"> PAGEREF _Toc240466337 \h </w:instrText>
+              <w:instrText xml:space="preserve"> PAGEREF _Toc240713053 \h </w:instrText>
             </w:r>
             <w:r>
               <w:rPr>
@@ -768,7 +768,7 @@
               <w14:ligatures w14:val="standardContextual"/>
             </w:rPr>
           </w:pPr>
-          <w:hyperlink w:anchor="_Toc240466338" w:history="1">
+          <w:hyperlink w:anchor="_Toc240713054" w:history="1">
             <w:r>
               <w:rPr>
                 <w:rStyle w:val="Hyperlink"/>
@@ -792,7 +792,7 @@
               <w:rPr>
                 <w:noProof/>
               </w:rPr>
-              <w:instrText xml:space="preserve"> PAGEREF _Toc240466338 \h </w:instrText>
+              <w:instrText xml:space="preserve"> PAGEREF _Toc240713054 \h </w:instrText>
             </w:r>
             <w:r>
               <w:rPr>
@@ -835,7 +835,7 @@
               <w14:ligatures w14:val="standardContextual"/>
             </w:rPr>
           </w:pPr>
-          <w:hyperlink w:anchor="_Toc240466339" w:history="1">
+          <w:hyperlink w:anchor="_Toc240713055" w:history="1">
             <w:r>
               <w:rPr>
                 <w:rStyle w:val="Hyperlink"/>
@@ -859,7 +859,7 @@
               <w:rPr>
                 <w:noProof/>
               </w:rPr>
-              <w:instrText xml:space="preserve"> PAGEREF _Toc240466339 \h </w:instrText>
+              <w:instrText xml:space="preserve"> PAGEREF _Toc240713055 \h </w:instrText>
             </w:r>
             <w:r>
               <w:rPr>
@@ -902,7 +902,7 @@
               <w14:ligatures w14:val="standardContextual"/>
             </w:rPr>
           </w:pPr>
-          <w:hyperlink w:anchor="_Toc240466340" w:history="1">
+          <w:hyperlink w:anchor="_Toc240713056" w:history="1">
             <w:r>
               <w:rPr>
                 <w:rStyle w:val="Hyperlink"/>
@@ -926,7 +926,7 @@
               <w:rPr>
                 <w:noProof/>
               </w:rPr>
-              <w:instrText xml:space="preserve"> PAGEREF _Toc240466340 \h </w:instrText>
+              <w:instrText xml:space="preserve"> PAGEREF _Toc240713056 \h </w:instrText>
             </w:r>
             <w:r>
               <w:rPr>
@@ -969,7 +969,7 @@
               <w14:ligatures w14:val="standardContextual"/>
             </w:rPr>
           </w:pPr>
-          <w:hyperlink w:anchor="_Toc240466341" w:history="1">
+          <w:hyperlink w:anchor="_Toc240713057" w:history="1">
             <w:r>
               <w:rPr>
                 <w:rStyle w:val="Hyperlink"/>
@@ -993,7 +993,7 @@
               <w:rPr>
                 <w:noProof/>
               </w:rPr>
-              <w:instrText xml:space="preserve"> PAGEREF _Toc240466341 \h </w:instrText>
+              <w:instrText xml:space="preserve"> PAGEREF _Toc240713057 \h </w:instrText>
             </w:r>
             <w:r>
               <w:rPr>
@@ -1036,7 +1036,7 @@
               <w14:ligatures w14:val="standardContextual"/>
             </w:rPr>
           </w:pPr>
-          <w:hyperlink w:anchor="_Toc240466342" w:history="1">
+          <w:hyperlink w:anchor="_Toc240713058" w:history="1">
             <w:r>
               <w:rPr>
                 <w:rStyle w:val="Hyperlink"/>
@@ -1060,7 +1060,7 @@
               <w:rPr>
                 <w:noProof/>
               </w:rPr>
-              <w:instrText xml:space="preserve"> PAGEREF _Toc240466342 \h </w:instrText>
+              <w:instrText xml:space="preserve"> PAGEREF _Toc240713058 \h </w:instrText>
             </w:r>
             <w:r>
               <w:rPr>
@@ -1103,7 +1103,7 @@
               <w14:ligatures w14:val="standardContextual"/>
             </w:rPr>
           </w:pPr>
-          <w:hyperlink w:anchor="_Toc240466343" w:history="1">
+          <w:hyperlink w:anchor="_Toc240713059" w:history="1">
             <w:r>
               <w:rPr>
                 <w:rStyle w:val="Hyperlink"/>
@@ -1127,7 +1127,7 @@
               <w:rPr>
                 <w:noProof/>
               </w:rPr>
-              <w:instrText xml:space="preserve"> PAGEREF _Toc240466343 \h </w:instrText>
+              <w:instrText xml:space="preserve"> PAGEREF _Toc240713059 \h </w:instrText>
             </w:r>
             <w:r>
               <w:rPr>
@@ -1170,7 +1170,7 @@
               <w14:ligatures w14:val="standardContextual"/>
             </w:rPr>
           </w:pPr>
-          <w:hyperlink w:anchor="_Toc240466344" w:history="1">
+          <w:hyperlink w:anchor="_Toc240713060" w:history="1">
             <w:r>
               <w:rPr>
                 <w:rStyle w:val="Hyperlink"/>
@@ -1194,7 +1194,7 @@
               <w:rPr>
                 <w:noProof/>
               </w:rPr>
-              <w:instrText xml:space="preserve"> PAGEREF _Toc240466344 \h </w:instrText>
+              <w:instrText xml:space="preserve"> PAGEREF _Toc240713060 \h </w:instrText>
             </w:r>
             <w:r>
               <w:rPr>
@@ -1237,7 +1237,7 @@
               <w14:ligatures w14:val="standardContextual"/>
             </w:rPr>
           </w:pPr>
-          <w:hyperlink w:anchor="_Toc240466345" w:history="1">
+          <w:hyperlink w:anchor="_Toc240713061" w:history="1">
             <w:r>
               <w:rPr>
                 <w:rStyle w:val="Hyperlink"/>
@@ -1261,7 +1261,7 @@
               <w:rPr>
                 <w:noProof/>
               </w:rPr>
-              <w:instrText xml:space="preserve"> PAGEREF _Toc240466345 \h </w:instrText>
+              <w:instrText xml:space="preserve"> PAGEREF _Toc240713061 \h </w:instrText>
             </w:r>
             <w:r>
               <w:rPr>
@@ -1304,7 +1304,7 @@
               <w14:ligatures w14:val="standardContextual"/>
             </w:rPr>
           </w:pPr>
-          <w:hyperlink w:anchor="_Toc240466346" w:history="1">
+          <w:hyperlink w:anchor="_Toc240713062" w:history="1">
             <w:r>
               <w:rPr>
                 <w:rStyle w:val="Hyperlink"/>
@@ -1328,7 +1328,7 @@
               <w:rPr>
                 <w:noProof/>
               </w:rPr>
-              <w:instrText xml:space="preserve"> PAGEREF _Toc240466346 \h </w:instrText>
+              <w:instrText xml:space="preserve"> PAGEREF _Toc240713062 \h </w:instrText>
             </w:r>
             <w:r>
               <w:rPr>
@@ -1371,7 +1371,7 @@
               <w14:ligatures w14:val="standardContextual"/>
             </w:rPr>
           </w:pPr>
-          <w:hyperlink w:anchor="_Toc240466347" w:history="1">
+          <w:hyperlink w:anchor="_Toc240713063" w:history="1">
             <w:r>
               <w:rPr>
                 <w:rStyle w:val="Hyperlink"/>
@@ -1395,7 +1395,7 @@
               <w:rPr>
                 <w:noProof/>
               </w:rPr>
-              <w:instrText xml:space="preserve"> PAGEREF _Toc240466347 \h </w:instrText>
+              <w:instrText xml:space="preserve"> PAGEREF _Toc240713063 \h </w:instrText>
             </w:r>
             <w:r>
               <w:rPr>
@@ -1438,7 +1438,7 @@
               <w14:ligatures w14:val="standardContextual"/>
             </w:rPr>
           </w:pPr>
-          <w:hyperlink w:anchor="_Toc240466348" w:history="1">
+          <w:hyperlink w:anchor="_Toc240713064" w:history="1">
             <w:r>
               <w:rPr>
                 <w:rStyle w:val="Hyperlink"/>
@@ -1462,7 +1462,7 @@
               <w:rPr>
                 <w:noProof/>
               </w:rPr>
-              <w:instrText xml:space="preserve"> PAGEREF _Toc240466348 \h </w:instrText>
+              <w:instrText xml:space="preserve"> PAGEREF _Toc240713064 \h </w:instrText>
             </w:r>
             <w:r>
               <w:rPr>
@@ -1505,7 +1505,7 @@
               <w14:ligatures w14:val="standardContextual"/>
             </w:rPr>
           </w:pPr>
-          <w:hyperlink w:anchor="_Toc240466349" w:history="1">
+          <w:hyperlink w:anchor="_Toc240713065" w:history="1">
             <w:r>
               <w:rPr>
                 <w:rStyle w:val="Hyperlink"/>
@@ -1529,7 +1529,7 @@
               <w:rPr>
                 <w:noProof/>
               </w:rPr>
-              <w:instrText xml:space="preserve"> PAGEREF _Toc240466349 \h </w:instrText>
+              <w:instrText xml:space="preserve"> PAGEREF _Toc240713065 \h </w:instrText>
             </w:r>
             <w:r>
               <w:rPr>
@@ -1572,7 +1572,7 @@
               <w14:ligatures w14:val="standardContextual"/>
             </w:rPr>
           </w:pPr>
-          <w:hyperlink w:anchor="_Toc240466350" w:history="1">
+          <w:hyperlink w:anchor="_Toc240713066" w:history="1">
             <w:r>
               <w:rPr>
                 <w:rStyle w:val="Hyperlink"/>
@@ -1596,7 +1596,7 @@
               <w:rPr>
                 <w:noProof/>
               </w:rPr>
-              <w:instrText xml:space="preserve"> PAGEREF _Toc240466350 \h </w:instrText>
+              <w:instrText xml:space="preserve"> PAGEREF _Toc240713066 \h </w:instrText>
             </w:r>
             <w:r>
               <w:rPr>
@@ -1639,7 +1639,7 @@
               <w14:ligatures w14:val="standardContextual"/>
             </w:rPr>
           </w:pPr>
-          <w:hyperlink w:anchor="_Toc240466351" w:history="1">
+          <w:hyperlink w:anchor="_Toc240713067" w:history="1">
             <w:r>
               <w:rPr>
                 <w:rStyle w:val="Hyperlink"/>
@@ -1663,7 +1663,7 @@
               <w:rPr>
                 <w:noProof/>
               </w:rPr>
-              <w:instrText xml:space="preserve"> PAGEREF _Toc240466351 \h </w:instrText>
+              <w:instrText xml:space="preserve"> PAGEREF _Toc240713067 \h </w:instrText>
             </w:r>
             <w:r>
               <w:rPr>
@@ -1706,7 +1706,7 @@
               <w14:ligatures w14:val="standardContextual"/>
             </w:rPr>
           </w:pPr>
-          <w:hyperlink w:anchor="_Toc240466352" w:history="1">
+          <w:hyperlink w:anchor="_Toc240713068" w:history="1">
             <w:r>
               <w:rPr>
                 <w:rStyle w:val="Hyperlink"/>
@@ -1730,7 +1730,7 @@
               <w:rPr>
                 <w:noProof/>
               </w:rPr>
-              <w:instrText xml:space="preserve"> PAGEREF _Toc240466352 \h </w:instrText>
+              <w:instrText xml:space="preserve"> PAGEREF _Toc240713068 \h </w:instrText>
             </w:r>
             <w:r>
               <w:rPr>
@@ -1773,7 +1773,7 @@
               <w14:ligatures w14:val="standardContextual"/>
             </w:rPr>
           </w:pPr>
-          <w:hyperlink w:anchor="_Toc240466353" w:history="1">
+          <w:hyperlink w:anchor="_Toc240713069" w:history="1">
             <w:r>
               <w:rPr>
                 <w:rStyle w:val="Hyperlink"/>
@@ -1797,7 +1797,7 @@
               <w:rPr>
                 <w:noProof/>
               </w:rPr>
-              <w:instrText xml:space="preserve"> PAGEREF _Toc240466353 \h </w:instrText>
+              <w:instrText xml:space="preserve"> PAGEREF _Toc240713069 \h </w:instrText>
             </w:r>
             <w:r>
               <w:rPr>
@@ -1840,7 +1840,7 @@
               <w14:ligatures w14:val="standardContextual"/>
             </w:rPr>
           </w:pPr>
-          <w:hyperlink w:anchor="_Toc240466354" w:history="1">
+          <w:hyperlink w:anchor="_Toc240713070" w:history="1">
             <w:r>
               <w:rPr>
                 <w:rStyle w:val="Hyperlink"/>
@@ -1864,7 +1864,7 @@
               <w:rPr>
                 <w:noProof/>
               </w:rPr>
-              <w:instrText xml:space="preserve"> PAGEREF _Toc240466354 \h </w:instrText>
+              <w:instrText xml:space="preserve"> PAGEREF _Toc240713070 \h </w:instrText>
             </w:r>
             <w:r>
               <w:rPr>
@@ -1907,7 +1907,7 @@
               <w14:ligatures w14:val="standardContextual"/>
             </w:rPr>
           </w:pPr>
-          <w:hyperlink w:anchor="_Toc240466355" w:history="1">
+          <w:hyperlink w:anchor="_Toc240713071" w:history="1">
             <w:r>
               <w:rPr>
                 <w:rStyle w:val="Hyperlink"/>
@@ -1931,7 +1931,7 @@
               <w:rPr>
                 <w:noProof/>
               </w:rPr>
-              <w:instrText xml:space="preserve"> PAGEREF _Toc240466355 \h </w:instrText>
+              <w:instrText xml:space="preserve"> PAGEREF _Toc240713071 \h </w:instrText>
             </w:r>
             <w:r>
               <w:rPr>
@@ -1974,7 +1974,7 @@
               <w14:ligatures w14:val="standardContextual"/>
             </w:rPr>
           </w:pPr>
-          <w:hyperlink w:anchor="_Toc240466356" w:history="1">
+          <w:hyperlink w:anchor="_Toc240713072" w:history="1">
             <w:r>
               <w:rPr>
                 <w:rStyle w:val="Hyperlink"/>
@@ -1998,7 +1998,7 @@
               <w:rPr>
                 <w:noProof/>
               </w:rPr>
-              <w:instrText xml:space="preserve"> PAGEREF _Toc240466356 \h </w:instrText>
+              <w:instrText xml:space="preserve"> PAGEREF _Toc240713072 \h </w:instrText>
             </w:r>
             <w:r>
               <w:rPr>
@@ -2041,7 +2041,7 @@
               <w14:ligatures w14:val="standardContextual"/>
             </w:rPr>
           </w:pPr>
-          <w:hyperlink w:anchor="_Toc240466357" w:history="1">
+          <w:hyperlink w:anchor="_Toc240713073" w:history="1">
             <w:r>
               <w:rPr>
                 <w:rStyle w:val="Hyperlink"/>
@@ -2065,7 +2065,7 @@
               <w:rPr>
                 <w:noProof/>
               </w:rPr>
-              <w:instrText xml:space="preserve"> PAGEREF _Toc240466357 \h </w:instrText>
+              <w:instrText xml:space="preserve"> PAGEREF _Toc240713073 \h </w:instrText>
             </w:r>
             <w:r>
               <w:rPr>
@@ -2108,7 +2108,7 @@
               <w14:ligatures w14:val="standardContextual"/>
             </w:rPr>
           </w:pPr>
-          <w:hyperlink w:anchor="_Toc240466358" w:history="1">
+          <w:hyperlink w:anchor="_Toc240713074" w:history="1">
             <w:r>
               <w:rPr>
                 <w:rStyle w:val="Hyperlink"/>
@@ -2132,7 +2132,7 @@
               <w:rPr>
                 <w:noProof/>
               </w:rPr>
-              <w:instrText xml:space="preserve"> PAGEREF _Toc240466358 \h </w:instrText>
+              <w:instrText xml:space="preserve"> PAGEREF _Toc240713074 \h </w:instrText>
             </w:r>
             <w:r>
               <w:rPr>
@@ -2171,7 +2171,7 @@
         <w:pStyle w:val="Heading1"/>
         <w:pageBreakBefore/>
       </w:pPr>
-      <w:bookmarkStart w:id="0" w:name="_Toc240466335"/>
+      <w:bookmarkStart w:id="0" w:name="_Toc240713051"/>
       <w:r>
         <w:lastRenderedPageBreak/>
         <w:t>1. Programme overview</w:t>
@@ -2577,7 +2577,7 @@
       <w:pPr>
         <w:pStyle w:val="Heading2"/>
       </w:pPr>
-      <w:bookmarkStart w:id="1" w:name="_Toc240466336"/>
+      <w:bookmarkStart w:id="1" w:name="_Toc240713052"/>
       <w:r>
         <w:t>1.1 Learning objectives</w:t>
       </w:r>
@@ -2678,7 +2678,7 @@
       <w:pPr>
         <w:pStyle w:val="Heading2"/>
       </w:pPr>
-      <w:bookmarkStart w:id="2" w:name="_Toc240466337"/>
+      <w:bookmarkStart w:id="2" w:name="_Toc240713053"/>
       <w:r>
         <w:t>1.2 Before the training (facilitator checklist)</w:t>
       </w:r>
@@ -3214,7 +3214,7 @@
       <w:pPr>
         <w:pStyle w:val="Heading2"/>
       </w:pPr>
-      <w:bookmarkStart w:id="3" w:name="_Toc240466338"/>
+      <w:bookmarkStart w:id="3" w:name="_Toc240713054"/>
       <w:r>
         <w:t>1.3 The practice environment</w:t>
       </w:r>
@@ -3360,7 +3360,7 @@
         <w:pStyle w:val="Heading1"/>
         <w:pageBreakBefore/>
       </w:pPr>
-      <w:bookmarkStart w:id="4" w:name="_Toc240466339"/>
+      <w:bookmarkStart w:id="4" w:name="_Toc240713055"/>
       <w:r>
         <w:lastRenderedPageBreak/>
         <w:t>2. Schedule</w:t>
@@ -3371,7 +3371,7 @@
       <w:pPr>
         <w:pStyle w:val="Heading2"/>
       </w:pPr>
-      <w:bookmarkStart w:id="5" w:name="_Toc240466340"/>
+      <w:bookmarkStart w:id="5" w:name="_Toc240713056"/>
       <w:r>
         <w:t>Day 1 — Foundations (all RAs)</w:t>
       </w:r>
@@ -4654,7 +4654,7 @@
       <w:pPr>
         <w:pStyle w:val="Heading2"/>
       </w:pPr>
-      <w:bookmarkStart w:id="6" w:name="_Toc240466341"/>
+      <w:bookmarkStart w:id="6" w:name="_Toc240713057"/>
       <w:r>
         <w:t>Day 2 — Role tracks</w:t>
       </w:r>
@@ -6143,7 +6143,7 @@
                 <w:sz w:val="19"/>
                 <w:szCs w:val="19"/>
               </w:rPr>
-              <w:t>Recording a source precisely; judging authenticity; Include / Exclude; interpretive memos; the Document Analysis Tool (Exclude skips Sections C–L)</w:t>
+              <w:t>Recording a source precisely; judging authenticity; Include / Exclude; interpretive memos; the Document Analysis Tool (Exclude skips Sections C–L); attaching or removing a source file; Auto-fill and how to review an AI draft</w:t>
             </w:r>
           </w:p>
         </w:tc>
@@ -6182,7 +6182,7 @@
       <w:pPr>
         <w:pStyle w:val="Heading2"/>
       </w:pPr>
-      <w:bookmarkStart w:id="7" w:name="_Toc240466342"/>
+      <w:bookmarkStart w:id="7" w:name="_Toc240713058"/>
       <w:r>
         <w:t>Day 3 — Practice and assessment</w:t>
       </w:r>
@@ -7152,7 +7152,7 @@
       <w:pPr>
         <w:pStyle w:val="Heading2"/>
       </w:pPr>
-      <w:bookmarkStart w:id="8" w:name="_Toc240466343"/>
+      <w:bookmarkStart w:id="8" w:name="_Toc240713059"/>
       <w:r>
         <w:t>After the training</w:t>
       </w:r>
@@ -7487,7 +7487,7 @@
         <w:pStyle w:val="Heading1"/>
         <w:pageBreakBefore/>
       </w:pPr>
-      <w:bookmarkStart w:id="9" w:name="_Toc240466344"/>
+      <w:bookmarkStart w:id="9" w:name="_Toc240713060"/>
       <w:r>
         <w:lastRenderedPageBreak/>
         <w:t>3. Session plans</w:t>
@@ -7506,7 +7506,7 @@
       <w:pPr>
         <w:pStyle w:val="Heading2"/>
       </w:pPr>
-      <w:bookmarkStart w:id="10" w:name="_Toc240466345"/>
+      <w:bookmarkStart w:id="10" w:name="_Toc240713061"/>
       <w:r>
         <w:t>Module 1 — The study (60 min)</w:t>
       </w:r>
@@ -7601,7 +7601,7 @@
       <w:pPr>
         <w:pStyle w:val="Heading2"/>
       </w:pPr>
-      <w:bookmarkStart w:id="11" w:name="_Toc240466346"/>
+      <w:bookmarkStart w:id="11" w:name="_Toc240713062"/>
       <w:r>
         <w:t>Module 2 — Research ethics and consent (60 min)</w:t>
       </w:r>
@@ -7696,7 +7696,7 @@
       <w:pPr>
         <w:pStyle w:val="Heading2"/>
       </w:pPr>
-      <w:bookmarkStart w:id="12" w:name="_Toc240466347"/>
+      <w:bookmarkStart w:id="12" w:name="_Toc240713063"/>
       <w:r>
         <w:t>Module 3 — Data protection (60 min)</w:t>
       </w:r>
@@ -7791,7 +7791,7 @@
       <w:pPr>
         <w:pStyle w:val="Heading2"/>
       </w:pPr>
-      <w:bookmarkStart w:id="13" w:name="_Toc240466348"/>
+      <w:bookmarkStart w:id="13" w:name="_Toc240713064"/>
       <w:r>
         <w:t>Module 5 — The portal (75 min)</w:t>
       </w:r>
@@ -7886,7 +7886,7 @@
       <w:pPr>
         <w:pStyle w:val="Heading2"/>
       </w:pPr>
-      <w:bookmarkStart w:id="14" w:name="_Toc240466349"/>
+      <w:bookmarkStart w:id="14" w:name="_Toc240713065"/>
       <w:r>
         <w:t>Module 6 — The respondent journey (45 min)</w:t>
       </w:r>
@@ -7982,7 +7982,7 @@
       <w:pPr>
         <w:pStyle w:val="Heading2"/>
       </w:pPr>
-      <w:bookmarkStart w:id="15" w:name="_Toc240466350"/>
+      <w:bookmarkStart w:id="15" w:name="_Toc240713066"/>
       <w:r>
         <w:t>Module 8 — Communication skills (90 min)</w:t>
       </w:r>
@@ -8077,7 +8077,7 @@
       <w:pPr>
         <w:pStyle w:val="Heading2"/>
       </w:pPr>
-      <w:bookmarkStart w:id="16" w:name="_Toc240466351"/>
+      <w:bookmarkStart w:id="16" w:name="_Toc240713067"/>
       <w:r>
         <w:t>Module 9 — Quality judgement (90 min)</w:t>
       </w:r>
@@ -8173,7 +8173,7 @@
         <w:pStyle w:val="Heading1"/>
         <w:pageBreakBefore/>
       </w:pPr>
-      <w:bookmarkStart w:id="17" w:name="_Toc240466352"/>
+      <w:bookmarkStart w:id="17" w:name="_Toc240713068"/>
       <w:r>
         <w:lastRenderedPageBreak/>
         <w:t>4. Role-plays and simulation</w:t>
@@ -9127,7 +9127,7 @@
       <w:pPr>
         <w:pStyle w:val="Heading2"/>
       </w:pPr>
-      <w:bookmarkStart w:id="18" w:name="_Toc240466353"/>
+      <w:bookmarkStart w:id="18" w:name="_Toc240713069"/>
       <w:r>
         <w:t>Field simulation (Day 3)</w:t>
       </w:r>
@@ -9222,7 +9222,7 @@
         <w:pStyle w:val="Heading1"/>
         <w:pageBreakBefore/>
       </w:pPr>
-      <w:bookmarkStart w:id="19" w:name="_Toc240466354"/>
+      <w:bookmarkStart w:id="19" w:name="_Toc240713070"/>
       <w:r>
         <w:lastRenderedPageBreak/>
         <w:t>5. Assessment and certification</w:t>
@@ -9233,7 +9233,7 @@
       <w:pPr>
         <w:pStyle w:val="Heading2"/>
       </w:pPr>
-      <w:bookmarkStart w:id="20" w:name="_Toc240466355"/>
+      <w:bookmarkStart w:id="20" w:name="_Toc240713071"/>
       <w:r>
         <w:t>5.1 Competencies</w:t>
       </w:r>
@@ -9624,7 +9624,7 @@
       <w:pPr>
         <w:pStyle w:val="Heading2"/>
       </w:pPr>
-      <w:bookmarkStart w:id="21" w:name="_Toc240466356"/>
+      <w:bookmarkStart w:id="21" w:name="_Toc240713072"/>
       <w:r>
         <w:t>5.2 Written assessment (answer key)</w:t>
       </w:r>
@@ -10984,7 +10984,7 @@
       <w:pPr>
         <w:pStyle w:val="Heading2"/>
       </w:pPr>
-      <w:bookmarkStart w:id="22" w:name="_Toc240466357"/>
+      <w:bookmarkStart w:id="22" w:name="_Toc240713073"/>
       <w:r>
         <w:t>5.3 Practical assessment</w:t>
       </w:r>
@@ -12247,7 +12247,7 @@
         <w:pStyle w:val="Heading1"/>
         <w:pageBreakBefore/>
       </w:pPr>
-      <w:bookmarkStart w:id="23" w:name="_Toc240466358"/>
+      <w:bookmarkStart w:id="23" w:name="_Toc240713074"/>
       <w:r>
         <w:lastRenderedPageBreak/>
         <w:t>6. Attendance register</w:t>
@@ -13826,7 +13826,7 @@
         <w:sz w:val="16"/>
         <w:szCs w:val="16"/>
       </w:rPr>
-      <w:t>Version 1.0 · 15 September 2026</w:t>
+      <w:t>Version 1.1 · 19 September 2026</w:t>
     </w:r>
     <w:r>
       <w:rPr>
@@ -13999,10 +13999,96 @@
 <file path=word/numbering.xml><?xml version="1.0" encoding="utf-8"?>
 <w:numbering xmlns:wpc="http://schemas.microsoft.com/office/word/2010/wordprocessingCanvas" xmlns:cx="http://schemas.microsoft.com/office/drawing/2014/chartex" xmlns:cx1="http://schemas.microsoft.com/office/drawing/2015/9/8/chartex" xmlns:cx2="http://schemas.microsoft.com/office/drawing/2015/10/21/chartex" xmlns:cx3="http://schemas.microsoft.com/office/drawing/2016/5/9/chartex" xmlns:cx4="http://schemas.microsoft.com/office/drawing/2016/5/10/chartex" xmlns:cx5="http://schemas.microsoft.com/office/drawing/2016/5/11/chartex" xmlns:cx6="http://schemas.microsoft.com/office/drawing/2016/5/12/chartex" xmlns:cx7="http://schemas.microsoft.com/office/drawing/2016/5/13/chartex" xmlns:cx8="http://schemas.microsoft.com/office/drawing/2016/5/14/chartex" xmlns:mc="http://schemas.openxmlformats.org/markup-compatibility/2006" xmlns:aink="http://schemas.microsoft.com/office/drawing/2016/ink" xmlns:am3d="http://schemas.microsoft.com/office/drawing/2017/model3d" xmlns:o="urn:schemas-microsoft-com:office:office" xmlns:oel="http://schemas.microsoft.com/office/2019/extlst" xmlns:r="http://schemas.openxmlformats.org/officeDocument/2006/relationships" xmlns:m="http://schemas.openxmlformats.org/officeDocument/2006/math" xmlns:v="urn:schemas-microsoft-com:vml" xmlns:wp14="http://schemas.microsoft.com/office/word/2010/wordprocessingDrawing" xmlns:wp="http://schemas.openxmlformats.org/drawingml/2006/wordprocessingDrawing" xmlns:w10="urn:schemas-microsoft-com:office:word" xmlns:w="http://schemas.openxmlformats.org/wordprocessingml/2006/main" xmlns:w14="http://schemas.microsoft.com/office/word/2010/wordml" xmlns:w15="http://schemas.microsoft.com/office/word/2012/wordml" xmlns:w16cex="http://schemas.microsoft.com/office/word/2018/wordml/cex" xmlns:w16cid="http://schemas.microsoft.com/office/word/2016/wordml/cid" xmlns:w16="http://schemas.microsoft.com/office/word/2018/wordml" xmlns:w16sdtdh="http://schemas.microsoft.com/office/word/2020/wordml/sdtdatahash" xmlns:w16se="http://schemas.microsoft.com/office/word/2015/wordml/symex" xmlns:wpg="http://schemas.microsoft.com/office/word/2010/wordprocessingGroup" xmlns:wpi="http://schemas.microsoft.com/office/word/2010/wordprocessingInk" xmlns:wne="http://schemas.microsoft.com/office/word/2006/wordml" xmlns:wps="http://schemas.microsoft.com/office/word/2010/wordprocessingShape" mc:Ignorable="w14 w15 w16se w16cid w16 w16cex w16sdtdh wp14">
   <w:abstractNum w:abstractNumId="0" w15:restartNumberingAfterBreak="0">
-    <w:nsid w:val="19544FC9"/>
+    <w:nsid w:val="252C34C5"/>
     <w:multiLevelType w:val="hybridMultilevel"/>
-    <w:tmpl w:val="34DC3652"/>
-    <w:lvl w:ilvl="0" w:tplc="3DA0A02A">
+    <w:tmpl w:val="6010C84A"/>
+    <w:lvl w:ilvl="0" w:tplc="594E9D50">
+      <w:start w:val="1"/>
+      <w:numFmt w:val="bullet"/>
+      <w:lvlText w:val="●"/>
+      <w:lvlJc w:val="left"/>
+      <w:pPr>
+        <w:ind w:left="720" w:hanging="360"/>
+      </w:pPr>
+    </w:lvl>
+    <w:lvl w:ilvl="1" w:tplc="7804B40A">
+      <w:start w:val="1"/>
+      <w:numFmt w:val="bullet"/>
+      <w:lvlText w:val="○"/>
+      <w:lvlJc w:val="left"/>
+      <w:pPr>
+        <w:ind w:left="1440" w:hanging="360"/>
+      </w:pPr>
+    </w:lvl>
+    <w:lvl w:ilvl="2" w:tplc="99A0114E">
+      <w:start w:val="1"/>
+      <w:numFmt w:val="bullet"/>
+      <w:lvlText w:val="■"/>
+      <w:lvlJc w:val="left"/>
+      <w:pPr>
+        <w:ind w:left="2160" w:hanging="360"/>
+      </w:pPr>
+    </w:lvl>
+    <w:lvl w:ilvl="3" w:tplc="4BAC9062">
+      <w:start w:val="1"/>
+      <w:numFmt w:val="bullet"/>
+      <w:lvlText w:val="●"/>
+      <w:lvlJc w:val="left"/>
+      <w:pPr>
+        <w:ind w:left="2880" w:hanging="360"/>
+      </w:pPr>
+    </w:lvl>
+    <w:lvl w:ilvl="4" w:tplc="8B50FDA2">
+      <w:start w:val="1"/>
+      <w:numFmt w:val="bullet"/>
+      <w:lvlText w:val="○"/>
+      <w:lvlJc w:val="left"/>
+      <w:pPr>
+        <w:ind w:left="3600" w:hanging="360"/>
+      </w:pPr>
+    </w:lvl>
+    <w:lvl w:ilvl="5" w:tplc="CC3EF872">
+      <w:start w:val="1"/>
+      <w:numFmt w:val="bullet"/>
+      <w:lvlText w:val="■"/>
+      <w:lvlJc w:val="left"/>
+      <w:pPr>
+        <w:ind w:left="4320" w:hanging="360"/>
+      </w:pPr>
+    </w:lvl>
+    <w:lvl w:ilvl="6" w:tplc="E72AE19A">
+      <w:start w:val="1"/>
+      <w:numFmt w:val="bullet"/>
+      <w:lvlText w:val="●"/>
+      <w:lvlJc w:val="left"/>
+      <w:pPr>
+        <w:ind w:left="5040" w:hanging="360"/>
+      </w:pPr>
+    </w:lvl>
+    <w:lvl w:ilvl="7" w:tplc="6EE8516E">
+      <w:start w:val="1"/>
+      <w:numFmt w:val="bullet"/>
+      <w:lvlText w:val="●"/>
+      <w:lvlJc w:val="left"/>
+      <w:pPr>
+        <w:ind w:left="5760" w:hanging="360"/>
+      </w:pPr>
+    </w:lvl>
+    <w:lvl w:ilvl="8" w:tplc="4920A1CA">
+      <w:start w:val="1"/>
+      <w:numFmt w:val="bullet"/>
+      <w:lvlText w:val="●"/>
+      <w:lvlJc w:val="left"/>
+      <w:pPr>
+        <w:ind w:left="6480" w:hanging="360"/>
+      </w:pPr>
+    </w:lvl>
+  </w:abstractNum>
+  <w:abstractNum w:abstractNumId="1" w15:restartNumberingAfterBreak="0">
+    <w:nsid w:val="2BA16A31"/>
+    <w:multiLevelType w:val="hybridMultilevel"/>
+    <w:tmpl w:val="405C80BE"/>
+    <w:lvl w:ilvl="0" w:tplc="915E3628">
       <w:start w:val="1"/>
       <w:numFmt w:val="bullet"/>
       <w:lvlText w:val="•"/>
@@ -14011,7 +14097,7 @@
         <w:ind w:left="460" w:hanging="280"/>
       </w:pPr>
     </w:lvl>
-    <w:lvl w:ilvl="1" w:tplc="D326EB5E">
+    <w:lvl w:ilvl="1" w:tplc="F730A37E">
       <w:start w:val="1"/>
       <w:numFmt w:val="bullet"/>
       <w:lvlText w:val="–"/>
@@ -14020,47 +14106,47 @@
         <w:ind w:left="900" w:hanging="280"/>
       </w:pPr>
     </w:lvl>
-    <w:lvl w:ilvl="2" w:tplc="02AE4F60">
+    <w:lvl w:ilvl="2" w:tplc="A7781D40">
       <w:numFmt w:val="decimal"/>
       <w:lvlText w:val=""/>
       <w:lvlJc w:val="left"/>
     </w:lvl>
-    <w:lvl w:ilvl="3" w:tplc="6BB8D69C">
+    <w:lvl w:ilvl="3" w:tplc="7306187C">
       <w:numFmt w:val="decimal"/>
       <w:lvlText w:val=""/>
       <w:lvlJc w:val="left"/>
     </w:lvl>
-    <w:lvl w:ilvl="4" w:tplc="C8EA70F8">
+    <w:lvl w:ilvl="4" w:tplc="BDB0BD10">
       <w:numFmt w:val="decimal"/>
       <w:lvlText w:val=""/>
       <w:lvlJc w:val="left"/>
     </w:lvl>
-    <w:lvl w:ilvl="5" w:tplc="56CAE230">
+    <w:lvl w:ilvl="5" w:tplc="AFEC8A94">
       <w:numFmt w:val="decimal"/>
       <w:lvlText w:val=""/>
       <w:lvlJc w:val="left"/>
     </w:lvl>
-    <w:lvl w:ilvl="6" w:tplc="DFC66FAE">
+    <w:lvl w:ilvl="6" w:tplc="B89600A0">
       <w:numFmt w:val="decimal"/>
       <w:lvlText w:val=""/>
       <w:lvlJc w:val="left"/>
     </w:lvl>
-    <w:lvl w:ilvl="7" w:tplc="E2601690">
+    <w:lvl w:ilvl="7" w:tplc="69D8F312">
       <w:numFmt w:val="decimal"/>
       <w:lvlText w:val=""/>
       <w:lvlJc w:val="left"/>
     </w:lvl>
-    <w:lvl w:ilvl="8" w:tplc="FA02E38C">
+    <w:lvl w:ilvl="8" w:tplc="BDDAFEDA">
       <w:numFmt w:val="decimal"/>
       <w:lvlText w:val=""/>
       <w:lvlJc w:val="left"/>
     </w:lvl>
   </w:abstractNum>
-  <w:abstractNum w:abstractNumId="1" w15:restartNumberingAfterBreak="0">
-    <w:nsid w:val="3BA569DB"/>
+  <w:abstractNum w:abstractNumId="2" w15:restartNumberingAfterBreak="0">
+    <w:nsid w:val="68850C93"/>
     <w:multiLevelType w:val="hybridMultilevel"/>
-    <w:tmpl w:val="77A435DC"/>
-    <w:lvl w:ilvl="0" w:tplc="BDBC7AC2">
+    <w:tmpl w:val="28F22564"/>
+    <w:lvl w:ilvl="0" w:tplc="DD74545E">
       <w:start w:val="1"/>
       <w:numFmt w:val="decimal"/>
       <w:lvlText w:val="%1."/>
@@ -14074,138 +14160,52 @@
         <w:color w:val="A67C27"/>
       </w:rPr>
     </w:lvl>
-    <w:lvl w:ilvl="1" w:tplc="ED6AC44A">
+    <w:lvl w:ilvl="1" w:tplc="2AD6B4AC">
       <w:numFmt w:val="decimal"/>
       <w:lvlText w:val=""/>
       <w:lvlJc w:val="left"/>
     </w:lvl>
-    <w:lvl w:ilvl="2" w:tplc="0428C380">
+    <w:lvl w:ilvl="2" w:tplc="D2663DDA">
       <w:numFmt w:val="decimal"/>
       <w:lvlText w:val=""/>
       <w:lvlJc w:val="left"/>
     </w:lvl>
-    <w:lvl w:ilvl="3" w:tplc="9F1A2F38">
+    <w:lvl w:ilvl="3" w:tplc="656E8916">
       <w:numFmt w:val="decimal"/>
       <w:lvlText w:val=""/>
       <w:lvlJc w:val="left"/>
     </w:lvl>
-    <w:lvl w:ilvl="4" w:tplc="02B8C19C">
+    <w:lvl w:ilvl="4" w:tplc="A8AE9450">
       <w:numFmt w:val="decimal"/>
       <w:lvlText w:val=""/>
       <w:lvlJc w:val="left"/>
     </w:lvl>
-    <w:lvl w:ilvl="5" w:tplc="1A849D8E">
+    <w:lvl w:ilvl="5" w:tplc="2CB809C8">
       <w:numFmt w:val="decimal"/>
       <w:lvlText w:val=""/>
       <w:lvlJc w:val="left"/>
     </w:lvl>
-    <w:lvl w:ilvl="6" w:tplc="E2545820">
+    <w:lvl w:ilvl="6" w:tplc="7CB0F1FC">
       <w:numFmt w:val="decimal"/>
       <w:lvlText w:val=""/>
       <w:lvlJc w:val="left"/>
     </w:lvl>
-    <w:lvl w:ilvl="7" w:tplc="1736E90C">
+    <w:lvl w:ilvl="7" w:tplc="F9DAA5C8">
       <w:numFmt w:val="decimal"/>
       <w:lvlText w:val=""/>
       <w:lvlJc w:val="left"/>
     </w:lvl>
-    <w:lvl w:ilvl="8" w:tplc="08142E2A">
+    <w:lvl w:ilvl="8" w:tplc="9684E89E">
       <w:numFmt w:val="decimal"/>
       <w:lvlText w:val=""/>
       <w:lvlJc w:val="left"/>
     </w:lvl>
   </w:abstractNum>
-  <w:abstractNum w:abstractNumId="2" w15:restartNumberingAfterBreak="0">
-    <w:nsid w:val="430A20A1"/>
+  <w:abstractNum w:abstractNumId="3" w15:restartNumberingAfterBreak="0">
+    <w:nsid w:val="702A598A"/>
     <w:multiLevelType w:val="hybridMultilevel"/>
-    <w:tmpl w:val="16704FB6"/>
-    <w:lvl w:ilvl="0" w:tplc="7BD4D452">
-      <w:start w:val="1"/>
-      <w:numFmt w:val="bullet"/>
-      <w:lvlText w:val="●"/>
-      <w:lvlJc w:val="left"/>
-      <w:pPr>
-        <w:ind w:left="720" w:hanging="360"/>
-      </w:pPr>
-    </w:lvl>
-    <w:lvl w:ilvl="1" w:tplc="D4B23AA4">
-      <w:start w:val="1"/>
-      <w:numFmt w:val="bullet"/>
-      <w:lvlText w:val="○"/>
-      <w:lvlJc w:val="left"/>
-      <w:pPr>
-        <w:ind w:left="1440" w:hanging="360"/>
-      </w:pPr>
-    </w:lvl>
-    <w:lvl w:ilvl="2" w:tplc="28E40C9E">
-      <w:start w:val="1"/>
-      <w:numFmt w:val="bullet"/>
-      <w:lvlText w:val="■"/>
-      <w:lvlJc w:val="left"/>
-      <w:pPr>
-        <w:ind w:left="2160" w:hanging="360"/>
-      </w:pPr>
-    </w:lvl>
-    <w:lvl w:ilvl="3" w:tplc="7CBEE284">
-      <w:start w:val="1"/>
-      <w:numFmt w:val="bullet"/>
-      <w:lvlText w:val="●"/>
-      <w:lvlJc w:val="left"/>
-      <w:pPr>
-        <w:ind w:left="2880" w:hanging="360"/>
-      </w:pPr>
-    </w:lvl>
-    <w:lvl w:ilvl="4" w:tplc="8368B79C">
-      <w:start w:val="1"/>
-      <w:numFmt w:val="bullet"/>
-      <w:lvlText w:val="○"/>
-      <w:lvlJc w:val="left"/>
-      <w:pPr>
-        <w:ind w:left="3600" w:hanging="360"/>
-      </w:pPr>
-    </w:lvl>
-    <w:lvl w:ilvl="5" w:tplc="75EC5D00">
-      <w:start w:val="1"/>
-      <w:numFmt w:val="bullet"/>
-      <w:lvlText w:val="■"/>
-      <w:lvlJc w:val="left"/>
-      <w:pPr>
-        <w:ind w:left="4320" w:hanging="360"/>
-      </w:pPr>
-    </w:lvl>
-    <w:lvl w:ilvl="6" w:tplc="51FED826">
-      <w:start w:val="1"/>
-      <w:numFmt w:val="bullet"/>
-      <w:lvlText w:val="●"/>
-      <w:lvlJc w:val="left"/>
-      <w:pPr>
-        <w:ind w:left="5040" w:hanging="360"/>
-      </w:pPr>
-    </w:lvl>
-    <w:lvl w:ilvl="7" w:tplc="C77C8AF8">
-      <w:start w:val="1"/>
-      <w:numFmt w:val="bullet"/>
-      <w:lvlText w:val="●"/>
-      <w:lvlJc w:val="left"/>
-      <w:pPr>
-        <w:ind w:left="5760" w:hanging="360"/>
-      </w:pPr>
-    </w:lvl>
-    <w:lvl w:ilvl="8" w:tplc="C48496C6">
-      <w:start w:val="1"/>
-      <w:numFmt w:val="bullet"/>
-      <w:lvlText w:val="●"/>
-      <w:lvlJc w:val="left"/>
-      <w:pPr>
-        <w:ind w:left="6480" w:hanging="360"/>
-      </w:pPr>
-    </w:lvl>
-  </w:abstractNum>
-  <w:abstractNum w:abstractNumId="3" w15:restartNumberingAfterBreak="0">
-    <w:nsid w:val="5DA96031"/>
-    <w:multiLevelType w:val="hybridMultilevel"/>
-    <w:tmpl w:val="1C6A84AE"/>
-    <w:lvl w:ilvl="0" w:tplc="8DAEEF0A">
+    <w:tmpl w:val="B874F3E8"/>
+    <w:lvl w:ilvl="0" w:tplc="9AEE4780">
       <w:start w:val="1"/>
       <w:numFmt w:val="decimal"/>
       <w:lvlText w:val="%1."/>
@@ -14219,67 +14219,67 @@
         <w:color w:val="A67C27"/>
       </w:rPr>
     </w:lvl>
-    <w:lvl w:ilvl="1" w:tplc="D3C4AF3A">
+    <w:lvl w:ilvl="1" w:tplc="72AA7290">
       <w:numFmt w:val="decimal"/>
       <w:lvlText w:val=""/>
       <w:lvlJc w:val="left"/>
     </w:lvl>
-    <w:lvl w:ilvl="2" w:tplc="E8E8C726">
+    <w:lvl w:ilvl="2" w:tplc="84DA3D0E">
       <w:numFmt w:val="decimal"/>
       <w:lvlText w:val=""/>
       <w:lvlJc w:val="left"/>
     </w:lvl>
-    <w:lvl w:ilvl="3" w:tplc="7F2077E4">
+    <w:lvl w:ilvl="3" w:tplc="A2D66B76">
       <w:numFmt w:val="decimal"/>
       <w:lvlText w:val=""/>
       <w:lvlJc w:val="left"/>
     </w:lvl>
-    <w:lvl w:ilvl="4" w:tplc="F694201C">
+    <w:lvl w:ilvl="4" w:tplc="F3C8E78C">
       <w:numFmt w:val="decimal"/>
       <w:lvlText w:val=""/>
       <w:lvlJc w:val="left"/>
     </w:lvl>
-    <w:lvl w:ilvl="5" w:tplc="434668DC">
+    <w:lvl w:ilvl="5" w:tplc="95AEDDA0">
       <w:numFmt w:val="decimal"/>
       <w:lvlText w:val=""/>
       <w:lvlJc w:val="left"/>
     </w:lvl>
-    <w:lvl w:ilvl="6" w:tplc="57C6BFE0">
+    <w:lvl w:ilvl="6" w:tplc="DA0A5A5A">
       <w:numFmt w:val="decimal"/>
       <w:lvlText w:val=""/>
       <w:lvlJc w:val="left"/>
     </w:lvl>
-    <w:lvl w:ilvl="7" w:tplc="AD54ECD4">
+    <w:lvl w:ilvl="7" w:tplc="A7F4E6BC">
       <w:numFmt w:val="decimal"/>
       <w:lvlText w:val=""/>
       <w:lvlJc w:val="left"/>
     </w:lvl>
-    <w:lvl w:ilvl="8" w:tplc="1C067038">
+    <w:lvl w:ilvl="8" w:tplc="561033BE">
       <w:numFmt w:val="decimal"/>
       <w:lvlText w:val=""/>
       <w:lvlJc w:val="left"/>
     </w:lvl>
   </w:abstractNum>
-  <w:num w:numId="1" w16cid:durableId="976879779">
-    <w:abstractNumId w:val="2"/>
-    <w:lvlOverride w:ilvl="0">
-      <w:startOverride w:val="1"/>
-    </w:lvlOverride>
-  </w:num>
-  <w:num w:numId="2" w16cid:durableId="626206820">
+  <w:num w:numId="1" w16cid:durableId="538854808">
     <w:abstractNumId w:val="0"/>
     <w:lvlOverride w:ilvl="0">
       <w:startOverride w:val="1"/>
     </w:lvlOverride>
   </w:num>
-  <w:num w:numId="3" w16cid:durableId="852888415">
+  <w:num w:numId="2" w16cid:durableId="1196237919">
     <w:abstractNumId w:val="1"/>
     <w:lvlOverride w:ilvl="0">
       <w:startOverride w:val="1"/>
     </w:lvlOverride>
   </w:num>
-  <w:num w:numId="4" w16cid:durableId="1011302838">
+  <w:num w:numId="3" w16cid:durableId="748385467">
     <w:abstractNumId w:val="3"/>
+    <w:lvlOverride w:ilvl="0">
+      <w:startOverride w:val="1"/>
+    </w:lvlOverride>
+  </w:num>
+  <w:num w:numId="4" w16cid:durableId="413623049">
+    <w:abstractNumId w:val="2"/>
     <w:lvlOverride w:ilvl="0">
       <w:startOverride w:val="1"/>
     </w:lvlOverride>
@@ -14904,7 +14904,7 @@
     <w:autoRedefine/>
     <w:uiPriority w:val="39"/>
     <w:unhideWhenUsed/>
-    <w:rsid w:val="00EF6E7C"/>
+    <w:rsid w:val="002639DF"/>
     <w:pPr>
       <w:spacing w:after="100"/>
     </w:pPr>
@@ -14916,7 +14916,7 @@
     <w:autoRedefine/>
     <w:uiPriority w:val="39"/>
     <w:unhideWhenUsed/>
-    <w:rsid w:val="00EF6E7C"/>
+    <w:rsid w:val="002639DF"/>
     <w:pPr>
       <w:spacing w:after="100"/>
       <w:ind w:left="210"/>

</xml_diff>

<commit_message>
docs: manuals (v1.4) and README for Quick add, Record details, sync flow; role guides updated
Co-Authored-By: Claude Sonnet 5 <noreply@anthropic.com>
</commit_message>
<xml_diff>
--- a/docs/manuals/RA_Training_Programme_and_Facilitator_Guide.docx
+++ b/docs/manuals/RA_Training_Programme_and_Facilitator_Guide.docx
@@ -469,7 +469,7 @@
                 <w:sz w:val="19"/>
                 <w:szCs w:val="19"/>
               </w:rPr>
-              <w:t>Version 1.3 · 20 September 2026</w:t>
+              <w:t>Version 1.4 · 20 September 2026</w:t>
             </w:r>
           </w:p>
         </w:tc>
@@ -538,7 +538,7 @@
     <w:sdt>
       <w:sdtPr>
         <w:alias w:val="Contents"/>
-        <w:id w:val="-94638834"/>
+        <w:id w:val="-482318670"/>
       </w:sdtPr>
       <w:sdtEndPr/>
       <w:sdtContent>
@@ -567,7 +567,7 @@
           <w:r>
             <w:fldChar w:fldCharType="separate"/>
           </w:r>
-          <w:hyperlink w:anchor="_Toc240767683" w:history="1">
+          <w:hyperlink w:anchor="_Toc240773228" w:history="1">
             <w:r>
               <w:rPr>
                 <w:rStyle w:val="Hyperlink"/>
@@ -591,7 +591,7 @@
               <w:rPr>
                 <w:noProof/>
               </w:rPr>
-              <w:instrText xml:space="preserve"> PAGEREF _Toc240767683 \h </w:instrText>
+              <w:instrText xml:space="preserve"> PAGEREF _Toc240773228 \h </w:instrText>
             </w:r>
             <w:r>
               <w:rPr>
@@ -634,7 +634,7 @@
               <w14:ligatures w14:val="standardContextual"/>
             </w:rPr>
           </w:pPr>
-          <w:hyperlink w:anchor="_Toc240767684" w:history="1">
+          <w:hyperlink w:anchor="_Toc240773229" w:history="1">
             <w:r>
               <w:rPr>
                 <w:rStyle w:val="Hyperlink"/>
@@ -658,7 +658,7 @@
               <w:rPr>
                 <w:noProof/>
               </w:rPr>
-              <w:instrText xml:space="preserve"> PAGEREF _Toc240767684 \h </w:instrText>
+              <w:instrText xml:space="preserve"> PAGEREF _Toc240773229 \h </w:instrText>
             </w:r>
             <w:r>
               <w:rPr>
@@ -701,7 +701,7 @@
               <w14:ligatures w14:val="standardContextual"/>
             </w:rPr>
           </w:pPr>
-          <w:hyperlink w:anchor="_Toc240767685" w:history="1">
+          <w:hyperlink w:anchor="_Toc240773230" w:history="1">
             <w:r>
               <w:rPr>
                 <w:rStyle w:val="Hyperlink"/>
@@ -725,7 +725,7 @@
               <w:rPr>
                 <w:noProof/>
               </w:rPr>
-              <w:instrText xml:space="preserve"> PAGEREF _Toc240767685 \h </w:instrText>
+              <w:instrText xml:space="preserve"> PAGEREF _Toc240773230 \h </w:instrText>
             </w:r>
             <w:r>
               <w:rPr>
@@ -768,7 +768,7 @@
               <w14:ligatures w14:val="standardContextual"/>
             </w:rPr>
           </w:pPr>
-          <w:hyperlink w:anchor="_Toc240767686" w:history="1">
+          <w:hyperlink w:anchor="_Toc240773231" w:history="1">
             <w:r>
               <w:rPr>
                 <w:rStyle w:val="Hyperlink"/>
@@ -792,7 +792,7 @@
               <w:rPr>
                 <w:noProof/>
               </w:rPr>
-              <w:instrText xml:space="preserve"> PAGEREF _Toc240767686 \h </w:instrText>
+              <w:instrText xml:space="preserve"> PAGEREF _Toc240773231 \h </w:instrText>
             </w:r>
             <w:r>
               <w:rPr>
@@ -835,7 +835,7 @@
               <w14:ligatures w14:val="standardContextual"/>
             </w:rPr>
           </w:pPr>
-          <w:hyperlink w:anchor="_Toc240767687" w:history="1">
+          <w:hyperlink w:anchor="_Toc240773232" w:history="1">
             <w:r>
               <w:rPr>
                 <w:rStyle w:val="Hyperlink"/>
@@ -859,7 +859,7 @@
               <w:rPr>
                 <w:noProof/>
               </w:rPr>
-              <w:instrText xml:space="preserve"> PAGEREF _Toc240767687 \h </w:instrText>
+              <w:instrText xml:space="preserve"> PAGEREF _Toc240773232 \h </w:instrText>
             </w:r>
             <w:r>
               <w:rPr>
@@ -902,7 +902,7 @@
               <w14:ligatures w14:val="standardContextual"/>
             </w:rPr>
           </w:pPr>
-          <w:hyperlink w:anchor="_Toc240767688" w:history="1">
+          <w:hyperlink w:anchor="_Toc240773233" w:history="1">
             <w:r>
               <w:rPr>
                 <w:rStyle w:val="Hyperlink"/>
@@ -926,7 +926,7 @@
               <w:rPr>
                 <w:noProof/>
               </w:rPr>
-              <w:instrText xml:space="preserve"> PAGEREF _Toc240767688 \h </w:instrText>
+              <w:instrText xml:space="preserve"> PAGEREF _Toc240773233 \h </w:instrText>
             </w:r>
             <w:r>
               <w:rPr>
@@ -969,7 +969,7 @@
               <w14:ligatures w14:val="standardContextual"/>
             </w:rPr>
           </w:pPr>
-          <w:hyperlink w:anchor="_Toc240767689" w:history="1">
+          <w:hyperlink w:anchor="_Toc240773234" w:history="1">
             <w:r>
               <w:rPr>
                 <w:rStyle w:val="Hyperlink"/>
@@ -993,7 +993,7 @@
               <w:rPr>
                 <w:noProof/>
               </w:rPr>
-              <w:instrText xml:space="preserve"> PAGEREF _Toc240767689 \h </w:instrText>
+              <w:instrText xml:space="preserve"> PAGEREF _Toc240773234 \h </w:instrText>
             </w:r>
             <w:r>
               <w:rPr>
@@ -1036,7 +1036,7 @@
               <w14:ligatures w14:val="standardContextual"/>
             </w:rPr>
           </w:pPr>
-          <w:hyperlink w:anchor="_Toc240767690" w:history="1">
+          <w:hyperlink w:anchor="_Toc240773235" w:history="1">
             <w:r>
               <w:rPr>
                 <w:rStyle w:val="Hyperlink"/>
@@ -1060,7 +1060,7 @@
               <w:rPr>
                 <w:noProof/>
               </w:rPr>
-              <w:instrText xml:space="preserve"> PAGEREF _Toc240767690 \h </w:instrText>
+              <w:instrText xml:space="preserve"> PAGEREF _Toc240773235 \h </w:instrText>
             </w:r>
             <w:r>
               <w:rPr>
@@ -1103,7 +1103,7 @@
               <w14:ligatures w14:val="standardContextual"/>
             </w:rPr>
           </w:pPr>
-          <w:hyperlink w:anchor="_Toc240767691" w:history="1">
+          <w:hyperlink w:anchor="_Toc240773236" w:history="1">
             <w:r>
               <w:rPr>
                 <w:rStyle w:val="Hyperlink"/>
@@ -1127,7 +1127,7 @@
               <w:rPr>
                 <w:noProof/>
               </w:rPr>
-              <w:instrText xml:space="preserve"> PAGEREF _Toc240767691 \h </w:instrText>
+              <w:instrText xml:space="preserve"> PAGEREF _Toc240773236 \h </w:instrText>
             </w:r>
             <w:r>
               <w:rPr>
@@ -1170,7 +1170,7 @@
               <w14:ligatures w14:val="standardContextual"/>
             </w:rPr>
           </w:pPr>
-          <w:hyperlink w:anchor="_Toc240767692" w:history="1">
+          <w:hyperlink w:anchor="_Toc240773237" w:history="1">
             <w:r>
               <w:rPr>
                 <w:rStyle w:val="Hyperlink"/>
@@ -1194,7 +1194,7 @@
               <w:rPr>
                 <w:noProof/>
               </w:rPr>
-              <w:instrText xml:space="preserve"> PAGEREF _Toc240767692 \h </w:instrText>
+              <w:instrText xml:space="preserve"> PAGEREF _Toc240773237 \h </w:instrText>
             </w:r>
             <w:r>
               <w:rPr>
@@ -1237,7 +1237,7 @@
               <w14:ligatures w14:val="standardContextual"/>
             </w:rPr>
           </w:pPr>
-          <w:hyperlink w:anchor="_Toc240767693" w:history="1">
+          <w:hyperlink w:anchor="_Toc240773238" w:history="1">
             <w:r>
               <w:rPr>
                 <w:rStyle w:val="Hyperlink"/>
@@ -1261,7 +1261,7 @@
               <w:rPr>
                 <w:noProof/>
               </w:rPr>
-              <w:instrText xml:space="preserve"> PAGEREF _Toc240767693 \h </w:instrText>
+              <w:instrText xml:space="preserve"> PAGEREF _Toc240773238 \h </w:instrText>
             </w:r>
             <w:r>
               <w:rPr>
@@ -1304,7 +1304,7 @@
               <w14:ligatures w14:val="standardContextual"/>
             </w:rPr>
           </w:pPr>
-          <w:hyperlink w:anchor="_Toc240767694" w:history="1">
+          <w:hyperlink w:anchor="_Toc240773239" w:history="1">
             <w:r>
               <w:rPr>
                 <w:rStyle w:val="Hyperlink"/>
@@ -1328,7 +1328,7 @@
               <w:rPr>
                 <w:noProof/>
               </w:rPr>
-              <w:instrText xml:space="preserve"> PAGEREF _Toc240767694 \h </w:instrText>
+              <w:instrText xml:space="preserve"> PAGEREF _Toc240773239 \h </w:instrText>
             </w:r>
             <w:r>
               <w:rPr>
@@ -1371,7 +1371,7 @@
               <w14:ligatures w14:val="standardContextual"/>
             </w:rPr>
           </w:pPr>
-          <w:hyperlink w:anchor="_Toc240767695" w:history="1">
+          <w:hyperlink w:anchor="_Toc240773240" w:history="1">
             <w:r>
               <w:rPr>
                 <w:rStyle w:val="Hyperlink"/>
@@ -1395,7 +1395,7 @@
               <w:rPr>
                 <w:noProof/>
               </w:rPr>
-              <w:instrText xml:space="preserve"> PAGEREF _Toc240767695 \h </w:instrText>
+              <w:instrText xml:space="preserve"> PAGEREF _Toc240773240 \h </w:instrText>
             </w:r>
             <w:r>
               <w:rPr>
@@ -1438,7 +1438,7 @@
               <w14:ligatures w14:val="standardContextual"/>
             </w:rPr>
           </w:pPr>
-          <w:hyperlink w:anchor="_Toc240767696" w:history="1">
+          <w:hyperlink w:anchor="_Toc240773241" w:history="1">
             <w:r>
               <w:rPr>
                 <w:rStyle w:val="Hyperlink"/>
@@ -1462,7 +1462,7 @@
               <w:rPr>
                 <w:noProof/>
               </w:rPr>
-              <w:instrText xml:space="preserve"> PAGEREF _Toc240767696 \h </w:instrText>
+              <w:instrText xml:space="preserve"> PAGEREF _Toc240773241 \h </w:instrText>
             </w:r>
             <w:r>
               <w:rPr>
@@ -1505,7 +1505,7 @@
               <w14:ligatures w14:val="standardContextual"/>
             </w:rPr>
           </w:pPr>
-          <w:hyperlink w:anchor="_Toc240767697" w:history="1">
+          <w:hyperlink w:anchor="_Toc240773242" w:history="1">
             <w:r>
               <w:rPr>
                 <w:rStyle w:val="Hyperlink"/>
@@ -1529,7 +1529,7 @@
               <w:rPr>
                 <w:noProof/>
               </w:rPr>
-              <w:instrText xml:space="preserve"> PAGEREF _Toc240767697 \h </w:instrText>
+              <w:instrText xml:space="preserve"> PAGEREF _Toc240773242 \h </w:instrText>
             </w:r>
             <w:r>
               <w:rPr>
@@ -1572,7 +1572,7 @@
               <w14:ligatures w14:val="standardContextual"/>
             </w:rPr>
           </w:pPr>
-          <w:hyperlink w:anchor="_Toc240767698" w:history="1">
+          <w:hyperlink w:anchor="_Toc240773243" w:history="1">
             <w:r>
               <w:rPr>
                 <w:rStyle w:val="Hyperlink"/>
@@ -1596,7 +1596,7 @@
               <w:rPr>
                 <w:noProof/>
               </w:rPr>
-              <w:instrText xml:space="preserve"> PAGEREF _Toc240767698 \h </w:instrText>
+              <w:instrText xml:space="preserve"> PAGEREF _Toc240773243 \h </w:instrText>
             </w:r>
             <w:r>
               <w:rPr>
@@ -1639,7 +1639,7 @@
               <w14:ligatures w14:val="standardContextual"/>
             </w:rPr>
           </w:pPr>
-          <w:hyperlink w:anchor="_Toc240767699" w:history="1">
+          <w:hyperlink w:anchor="_Toc240773244" w:history="1">
             <w:r>
               <w:rPr>
                 <w:rStyle w:val="Hyperlink"/>
@@ -1663,7 +1663,7 @@
               <w:rPr>
                 <w:noProof/>
               </w:rPr>
-              <w:instrText xml:space="preserve"> PAGEREF _Toc240767699 \h </w:instrText>
+              <w:instrText xml:space="preserve"> PAGEREF _Toc240773244 \h </w:instrText>
             </w:r>
             <w:r>
               <w:rPr>
@@ -1706,7 +1706,7 @@
               <w14:ligatures w14:val="standardContextual"/>
             </w:rPr>
           </w:pPr>
-          <w:hyperlink w:anchor="_Toc240767700" w:history="1">
+          <w:hyperlink w:anchor="_Toc240773245" w:history="1">
             <w:r>
               <w:rPr>
                 <w:rStyle w:val="Hyperlink"/>
@@ -1730,7 +1730,7 @@
               <w:rPr>
                 <w:noProof/>
               </w:rPr>
-              <w:instrText xml:space="preserve"> PAGEREF _Toc240767700 \h </w:instrText>
+              <w:instrText xml:space="preserve"> PAGEREF _Toc240773245 \h </w:instrText>
             </w:r>
             <w:r>
               <w:rPr>
@@ -1773,7 +1773,7 @@
               <w14:ligatures w14:val="standardContextual"/>
             </w:rPr>
           </w:pPr>
-          <w:hyperlink w:anchor="_Toc240767701" w:history="1">
+          <w:hyperlink w:anchor="_Toc240773246" w:history="1">
             <w:r>
               <w:rPr>
                 <w:rStyle w:val="Hyperlink"/>
@@ -1797,7 +1797,7 @@
               <w:rPr>
                 <w:noProof/>
               </w:rPr>
-              <w:instrText xml:space="preserve"> PAGEREF _Toc240767701 \h </w:instrText>
+              <w:instrText xml:space="preserve"> PAGEREF _Toc240773246 \h </w:instrText>
             </w:r>
             <w:r>
               <w:rPr>
@@ -1840,7 +1840,7 @@
               <w14:ligatures w14:val="standardContextual"/>
             </w:rPr>
           </w:pPr>
-          <w:hyperlink w:anchor="_Toc240767702" w:history="1">
+          <w:hyperlink w:anchor="_Toc240773247" w:history="1">
             <w:r>
               <w:rPr>
                 <w:rStyle w:val="Hyperlink"/>
@@ -1864,7 +1864,7 @@
               <w:rPr>
                 <w:noProof/>
               </w:rPr>
-              <w:instrText xml:space="preserve"> PAGEREF _Toc240767702 \h </w:instrText>
+              <w:instrText xml:space="preserve"> PAGEREF _Toc240773247 \h </w:instrText>
             </w:r>
             <w:r>
               <w:rPr>
@@ -1907,7 +1907,7 @@
               <w14:ligatures w14:val="standardContextual"/>
             </w:rPr>
           </w:pPr>
-          <w:hyperlink w:anchor="_Toc240767703" w:history="1">
+          <w:hyperlink w:anchor="_Toc240773248" w:history="1">
             <w:r>
               <w:rPr>
                 <w:rStyle w:val="Hyperlink"/>
@@ -1931,7 +1931,7 @@
               <w:rPr>
                 <w:noProof/>
               </w:rPr>
-              <w:instrText xml:space="preserve"> PAGEREF _Toc240767703 \h </w:instrText>
+              <w:instrText xml:space="preserve"> PAGEREF _Toc240773248 \h </w:instrText>
             </w:r>
             <w:r>
               <w:rPr>
@@ -1974,7 +1974,7 @@
               <w14:ligatures w14:val="standardContextual"/>
             </w:rPr>
           </w:pPr>
-          <w:hyperlink w:anchor="_Toc240767704" w:history="1">
+          <w:hyperlink w:anchor="_Toc240773249" w:history="1">
             <w:r>
               <w:rPr>
                 <w:rStyle w:val="Hyperlink"/>
@@ -1998,7 +1998,7 @@
               <w:rPr>
                 <w:noProof/>
               </w:rPr>
-              <w:instrText xml:space="preserve"> PAGEREF _Toc240767704 \h </w:instrText>
+              <w:instrText xml:space="preserve"> PAGEREF _Toc240773249 \h </w:instrText>
             </w:r>
             <w:r>
               <w:rPr>
@@ -2041,7 +2041,7 @@
               <w14:ligatures w14:val="standardContextual"/>
             </w:rPr>
           </w:pPr>
-          <w:hyperlink w:anchor="_Toc240767705" w:history="1">
+          <w:hyperlink w:anchor="_Toc240773250" w:history="1">
             <w:r>
               <w:rPr>
                 <w:rStyle w:val="Hyperlink"/>
@@ -2065,7 +2065,7 @@
               <w:rPr>
                 <w:noProof/>
               </w:rPr>
-              <w:instrText xml:space="preserve"> PAGEREF _Toc240767705 \h </w:instrText>
+              <w:instrText xml:space="preserve"> PAGEREF _Toc240773250 \h </w:instrText>
             </w:r>
             <w:r>
               <w:rPr>
@@ -2108,7 +2108,7 @@
               <w14:ligatures w14:val="standardContextual"/>
             </w:rPr>
           </w:pPr>
-          <w:hyperlink w:anchor="_Toc240767706" w:history="1">
+          <w:hyperlink w:anchor="_Toc240773251" w:history="1">
             <w:r>
               <w:rPr>
                 <w:rStyle w:val="Hyperlink"/>
@@ -2132,7 +2132,7 @@
               <w:rPr>
                 <w:noProof/>
               </w:rPr>
-              <w:instrText xml:space="preserve"> PAGEREF _Toc240767706 \h </w:instrText>
+              <w:instrText xml:space="preserve"> PAGEREF _Toc240773251 \h </w:instrText>
             </w:r>
             <w:r>
               <w:rPr>
@@ -2171,7 +2171,7 @@
         <w:pStyle w:val="Heading1"/>
         <w:pageBreakBefore/>
       </w:pPr>
-      <w:bookmarkStart w:id="0" w:name="_Toc240767683"/>
+      <w:bookmarkStart w:id="0" w:name="_Toc240773228"/>
       <w:r>
         <w:lastRenderedPageBreak/>
         <w:t>1. Programme overview</w:t>
@@ -2577,7 +2577,7 @@
       <w:pPr>
         <w:pStyle w:val="Heading2"/>
       </w:pPr>
-      <w:bookmarkStart w:id="1" w:name="_Toc240767684"/>
+      <w:bookmarkStart w:id="1" w:name="_Toc240773229"/>
       <w:r>
         <w:t>1.1 Learning objectives</w:t>
       </w:r>
@@ -2678,7 +2678,7 @@
       <w:pPr>
         <w:pStyle w:val="Heading2"/>
       </w:pPr>
-      <w:bookmarkStart w:id="2" w:name="_Toc240767685"/>
+      <w:bookmarkStart w:id="2" w:name="_Toc240773230"/>
       <w:r>
         <w:t>1.2 Before the training (facilitator checklist)</w:t>
       </w:r>
@@ -3214,7 +3214,7 @@
       <w:pPr>
         <w:pStyle w:val="Heading2"/>
       </w:pPr>
-      <w:bookmarkStart w:id="3" w:name="_Toc240767686"/>
+      <w:bookmarkStart w:id="3" w:name="_Toc240773231"/>
       <w:r>
         <w:t>1.3 The practice environment</w:t>
       </w:r>
@@ -3360,7 +3360,7 @@
         <w:pStyle w:val="Heading1"/>
         <w:pageBreakBefore/>
       </w:pPr>
-      <w:bookmarkStart w:id="4" w:name="_Toc240767687"/>
+      <w:bookmarkStart w:id="4" w:name="_Toc240773232"/>
       <w:r>
         <w:lastRenderedPageBreak/>
         <w:t>2. Schedule</w:t>
@@ -3371,7 +3371,7 @@
       <w:pPr>
         <w:pStyle w:val="Heading2"/>
       </w:pPr>
-      <w:bookmarkStart w:id="5" w:name="_Toc240767688"/>
+      <w:bookmarkStart w:id="5" w:name="_Toc240773233"/>
       <w:r>
         <w:t>Day 1 — Foundations (all RAs)</w:t>
       </w:r>
@@ -4654,7 +4654,7 @@
       <w:pPr>
         <w:pStyle w:val="Heading2"/>
       </w:pPr>
-      <w:bookmarkStart w:id="6" w:name="_Toc240767689"/>
+      <w:bookmarkStart w:id="6" w:name="_Toc240773234"/>
       <w:r>
         <w:t>Day 2 — Role tracks</w:t>
       </w:r>
@@ -6182,7 +6182,7 @@
       <w:pPr>
         <w:pStyle w:val="Heading2"/>
       </w:pPr>
-      <w:bookmarkStart w:id="7" w:name="_Toc240767690"/>
+      <w:bookmarkStart w:id="7" w:name="_Toc240773235"/>
       <w:r>
         <w:t>Day 3 — Practice and assessment</w:t>
       </w:r>
@@ -7152,7 +7152,7 @@
       <w:pPr>
         <w:pStyle w:val="Heading2"/>
       </w:pPr>
-      <w:bookmarkStart w:id="8" w:name="_Toc240767691"/>
+      <w:bookmarkStart w:id="8" w:name="_Toc240773236"/>
       <w:r>
         <w:t>After the training</w:t>
       </w:r>
@@ -7487,7 +7487,7 @@
         <w:pStyle w:val="Heading1"/>
         <w:pageBreakBefore/>
       </w:pPr>
-      <w:bookmarkStart w:id="9" w:name="_Toc240767692"/>
+      <w:bookmarkStart w:id="9" w:name="_Toc240773237"/>
       <w:r>
         <w:lastRenderedPageBreak/>
         <w:t>3. Session plans</w:t>
@@ -7506,7 +7506,7 @@
       <w:pPr>
         <w:pStyle w:val="Heading2"/>
       </w:pPr>
-      <w:bookmarkStart w:id="10" w:name="_Toc240767693"/>
+      <w:bookmarkStart w:id="10" w:name="_Toc240773238"/>
       <w:r>
         <w:t>Module 1 — The study (60 min)</w:t>
       </w:r>
@@ -7601,7 +7601,7 @@
       <w:pPr>
         <w:pStyle w:val="Heading2"/>
       </w:pPr>
-      <w:bookmarkStart w:id="11" w:name="_Toc240767694"/>
+      <w:bookmarkStart w:id="11" w:name="_Toc240773239"/>
       <w:r>
         <w:t>Module 2 — Research ethics and consent (60 min)</w:t>
       </w:r>
@@ -7696,7 +7696,7 @@
       <w:pPr>
         <w:pStyle w:val="Heading2"/>
       </w:pPr>
-      <w:bookmarkStart w:id="12" w:name="_Toc240767695"/>
+      <w:bookmarkStart w:id="12" w:name="_Toc240773240"/>
       <w:r>
         <w:t>Module 3 — Data protection (60 min)</w:t>
       </w:r>
@@ -7791,7 +7791,7 @@
       <w:pPr>
         <w:pStyle w:val="Heading2"/>
       </w:pPr>
-      <w:bookmarkStart w:id="13" w:name="_Toc240767696"/>
+      <w:bookmarkStart w:id="13" w:name="_Toc240773241"/>
       <w:r>
         <w:t>Module 5 — The portal (75 min)</w:t>
       </w:r>
@@ -7886,7 +7886,7 @@
       <w:pPr>
         <w:pStyle w:val="Heading2"/>
       </w:pPr>
-      <w:bookmarkStart w:id="14" w:name="_Toc240767697"/>
+      <w:bookmarkStart w:id="14" w:name="_Toc240773242"/>
       <w:r>
         <w:t>Module 6 — The respondent journey (45 min)</w:t>
       </w:r>
@@ -7982,7 +7982,7 @@
       <w:pPr>
         <w:pStyle w:val="Heading2"/>
       </w:pPr>
-      <w:bookmarkStart w:id="15" w:name="_Toc240767698"/>
+      <w:bookmarkStart w:id="15" w:name="_Toc240773243"/>
       <w:r>
         <w:t>Module 8 — Communication skills (90 min)</w:t>
       </w:r>
@@ -8077,7 +8077,7 @@
       <w:pPr>
         <w:pStyle w:val="Heading2"/>
       </w:pPr>
-      <w:bookmarkStart w:id="16" w:name="_Toc240767699"/>
+      <w:bookmarkStart w:id="16" w:name="_Toc240773244"/>
       <w:r>
         <w:t>Module 9 — Quality judgement (90 min)</w:t>
       </w:r>
@@ -8173,7 +8173,7 @@
         <w:pStyle w:val="Heading1"/>
         <w:pageBreakBefore/>
       </w:pPr>
-      <w:bookmarkStart w:id="17" w:name="_Toc240767700"/>
+      <w:bookmarkStart w:id="17" w:name="_Toc240773245"/>
       <w:r>
         <w:lastRenderedPageBreak/>
         <w:t>4. Role-plays and simulation</w:t>
@@ -9127,7 +9127,7 @@
       <w:pPr>
         <w:pStyle w:val="Heading2"/>
       </w:pPr>
-      <w:bookmarkStart w:id="18" w:name="_Toc240767701"/>
+      <w:bookmarkStart w:id="18" w:name="_Toc240773246"/>
       <w:r>
         <w:t>Field simulation (Day 3)</w:t>
       </w:r>
@@ -9222,7 +9222,7 @@
         <w:pStyle w:val="Heading1"/>
         <w:pageBreakBefore/>
       </w:pPr>
-      <w:bookmarkStart w:id="19" w:name="_Toc240767702"/>
+      <w:bookmarkStart w:id="19" w:name="_Toc240773247"/>
       <w:r>
         <w:lastRenderedPageBreak/>
         <w:t>5. Assessment and certification</w:t>
@@ -9233,7 +9233,7 @@
       <w:pPr>
         <w:pStyle w:val="Heading2"/>
       </w:pPr>
-      <w:bookmarkStart w:id="20" w:name="_Toc240767703"/>
+      <w:bookmarkStart w:id="20" w:name="_Toc240773248"/>
       <w:r>
         <w:t>5.1 Competencies</w:t>
       </w:r>
@@ -9624,7 +9624,7 @@
       <w:pPr>
         <w:pStyle w:val="Heading2"/>
       </w:pPr>
-      <w:bookmarkStart w:id="21" w:name="_Toc240767704"/>
+      <w:bookmarkStart w:id="21" w:name="_Toc240773249"/>
       <w:r>
         <w:t>5.2 Written assessment (answer key)</w:t>
       </w:r>
@@ -10984,7 +10984,7 @@
       <w:pPr>
         <w:pStyle w:val="Heading2"/>
       </w:pPr>
-      <w:bookmarkStart w:id="22" w:name="_Toc240767705"/>
+      <w:bookmarkStart w:id="22" w:name="_Toc240773250"/>
       <w:r>
         <w:t>5.3 Practical assessment</w:t>
       </w:r>
@@ -12247,7 +12247,7 @@
         <w:pStyle w:val="Heading1"/>
         <w:pageBreakBefore/>
       </w:pPr>
-      <w:bookmarkStart w:id="23" w:name="_Toc240767706"/>
+      <w:bookmarkStart w:id="23" w:name="_Toc240773251"/>
       <w:r>
         <w:lastRenderedPageBreak/>
         <w:t>6. Attendance register</w:t>
@@ -13826,7 +13826,7 @@
         <w:sz w:val="16"/>
         <w:szCs w:val="16"/>
       </w:rPr>
-      <w:t>Version 1.3 · 20 September 2026</w:t>
+      <w:t>Version 1.4 · 20 September 2026</w:t>
     </w:r>
     <w:r>
       <w:rPr>
@@ -13999,10 +13999,10 @@
 <file path=word/numbering.xml><?xml version="1.0" encoding="utf-8"?>
 <w:numbering xmlns:wpc="http://schemas.microsoft.com/office/word/2010/wordprocessingCanvas" xmlns:cx="http://schemas.microsoft.com/office/drawing/2014/chartex" xmlns:cx1="http://schemas.microsoft.com/office/drawing/2015/9/8/chartex" xmlns:cx2="http://schemas.microsoft.com/office/drawing/2015/10/21/chartex" xmlns:cx3="http://schemas.microsoft.com/office/drawing/2016/5/9/chartex" xmlns:cx4="http://schemas.microsoft.com/office/drawing/2016/5/10/chartex" xmlns:cx5="http://schemas.microsoft.com/office/drawing/2016/5/11/chartex" xmlns:cx6="http://schemas.microsoft.com/office/drawing/2016/5/12/chartex" xmlns:cx7="http://schemas.microsoft.com/office/drawing/2016/5/13/chartex" xmlns:cx8="http://schemas.microsoft.com/office/drawing/2016/5/14/chartex" xmlns:mc="http://schemas.openxmlformats.org/markup-compatibility/2006" xmlns:aink="http://schemas.microsoft.com/office/drawing/2016/ink" xmlns:am3d="http://schemas.microsoft.com/office/drawing/2017/model3d" xmlns:o="urn:schemas-microsoft-com:office:office" xmlns:oel="http://schemas.microsoft.com/office/2019/extlst" xmlns:r="http://schemas.openxmlformats.org/officeDocument/2006/relationships" xmlns:m="http://schemas.openxmlformats.org/officeDocument/2006/math" xmlns:v="urn:schemas-microsoft-com:vml" xmlns:wp14="http://schemas.microsoft.com/office/word/2010/wordprocessingDrawing" xmlns:wp="http://schemas.openxmlformats.org/drawingml/2006/wordprocessingDrawing" xmlns:w10="urn:schemas-microsoft-com:office:word" xmlns:w="http://schemas.openxmlformats.org/wordprocessingml/2006/main" xmlns:w14="http://schemas.microsoft.com/office/word/2010/wordml" xmlns:w15="http://schemas.microsoft.com/office/word/2012/wordml" xmlns:w16cex="http://schemas.microsoft.com/office/word/2018/wordml/cex" xmlns:w16cid="http://schemas.microsoft.com/office/word/2016/wordml/cid" xmlns:w16="http://schemas.microsoft.com/office/word/2018/wordml" xmlns:w16sdtdh="http://schemas.microsoft.com/office/word/2020/wordml/sdtdatahash" xmlns:w16se="http://schemas.microsoft.com/office/word/2015/wordml/symex" xmlns:wpg="http://schemas.microsoft.com/office/word/2010/wordprocessingGroup" xmlns:wpi="http://schemas.microsoft.com/office/word/2010/wordprocessingInk" xmlns:wne="http://schemas.microsoft.com/office/word/2006/wordml" xmlns:wps="http://schemas.microsoft.com/office/word/2010/wordprocessingShape" mc:Ignorable="w14 w15 w16se w16cid w16 w16cex w16sdtdh wp14">
   <w:abstractNum w:abstractNumId="0" w15:restartNumberingAfterBreak="0">
-    <w:nsid w:val="19904EC8"/>
+    <w:nsid w:val="3BFD14B4"/>
     <w:multiLevelType w:val="hybridMultilevel"/>
-    <w:tmpl w:val="4B9636F0"/>
-    <w:lvl w:ilvl="0" w:tplc="FB129DCA">
+    <w:tmpl w:val="D09218DA"/>
+    <w:lvl w:ilvl="0" w:tplc="B9581A0A">
       <w:start w:val="1"/>
       <w:numFmt w:val="decimal"/>
       <w:lvlText w:val="%1."/>
@@ -14016,110 +14016,138 @@
         <w:color w:val="A67C27"/>
       </w:rPr>
     </w:lvl>
-    <w:lvl w:ilvl="1" w:tplc="D3B44AC0">
+    <w:lvl w:ilvl="1" w:tplc="4C1434AA">
       <w:numFmt w:val="decimal"/>
       <w:lvlText w:val=""/>
       <w:lvlJc w:val="left"/>
     </w:lvl>
-    <w:lvl w:ilvl="2" w:tplc="101A2A8A">
+    <w:lvl w:ilvl="2" w:tplc="BDF6271E">
       <w:numFmt w:val="decimal"/>
       <w:lvlText w:val=""/>
       <w:lvlJc w:val="left"/>
     </w:lvl>
-    <w:lvl w:ilvl="3" w:tplc="53CC168A">
+    <w:lvl w:ilvl="3" w:tplc="3276611C">
       <w:numFmt w:val="decimal"/>
       <w:lvlText w:val=""/>
       <w:lvlJc w:val="left"/>
     </w:lvl>
-    <w:lvl w:ilvl="4" w:tplc="068ED2D6">
+    <w:lvl w:ilvl="4" w:tplc="E91ED480">
       <w:numFmt w:val="decimal"/>
       <w:lvlText w:val=""/>
       <w:lvlJc w:val="left"/>
     </w:lvl>
-    <w:lvl w:ilvl="5" w:tplc="E4B0AFFA">
+    <w:lvl w:ilvl="5" w:tplc="BA340990">
       <w:numFmt w:val="decimal"/>
       <w:lvlText w:val=""/>
       <w:lvlJc w:val="left"/>
     </w:lvl>
-    <w:lvl w:ilvl="6" w:tplc="86E22E1E">
+    <w:lvl w:ilvl="6" w:tplc="2FFAEBFC">
       <w:numFmt w:val="decimal"/>
       <w:lvlText w:val=""/>
       <w:lvlJc w:val="left"/>
     </w:lvl>
-    <w:lvl w:ilvl="7" w:tplc="B5645E24">
+    <w:lvl w:ilvl="7" w:tplc="9F760A42">
       <w:numFmt w:val="decimal"/>
       <w:lvlText w:val=""/>
       <w:lvlJc w:val="left"/>
     </w:lvl>
-    <w:lvl w:ilvl="8" w:tplc="109226F4">
+    <w:lvl w:ilvl="8" w:tplc="074C5864">
       <w:numFmt w:val="decimal"/>
       <w:lvlText w:val=""/>
       <w:lvlJc w:val="left"/>
     </w:lvl>
   </w:abstractNum>
   <w:abstractNum w:abstractNumId="1" w15:restartNumberingAfterBreak="0">
-    <w:nsid w:val="25B6029A"/>
+    <w:nsid w:val="4F134EEF"/>
     <w:multiLevelType w:val="hybridMultilevel"/>
-    <w:tmpl w:val="164CEAF8"/>
-    <w:lvl w:ilvl="0" w:tplc="B790A366">
+    <w:tmpl w:val="EF5A160A"/>
+    <w:lvl w:ilvl="0" w:tplc="BC2203C2">
       <w:start w:val="1"/>
       <w:numFmt w:val="bullet"/>
-      <w:lvlText w:val="•"/>
+      <w:lvlText w:val="●"/>
       <w:lvlJc w:val="left"/>
       <w:pPr>
-        <w:ind w:left="460" w:hanging="280"/>
+        <w:ind w:left="720" w:hanging="360"/>
       </w:pPr>
     </w:lvl>
-    <w:lvl w:ilvl="1" w:tplc="1AF44214">
+    <w:lvl w:ilvl="1" w:tplc="768404CA">
       <w:start w:val="1"/>
       <w:numFmt w:val="bullet"/>
-      <w:lvlText w:val="–"/>
+      <w:lvlText w:val="○"/>
       <w:lvlJc w:val="left"/>
       <w:pPr>
-        <w:ind w:left="900" w:hanging="280"/>
+        <w:ind w:left="1440" w:hanging="360"/>
       </w:pPr>
     </w:lvl>
-    <w:lvl w:ilvl="2" w:tplc="67D84E6E">
-      <w:numFmt w:val="decimal"/>
-      <w:lvlText w:val=""/>
+    <w:lvl w:ilvl="2" w:tplc="10085FD2">
+      <w:start w:val="1"/>
+      <w:numFmt w:val="bullet"/>
+      <w:lvlText w:val="■"/>
       <w:lvlJc w:val="left"/>
+      <w:pPr>
+        <w:ind w:left="2160" w:hanging="360"/>
+      </w:pPr>
     </w:lvl>
-    <w:lvl w:ilvl="3" w:tplc="2DF0B18E">
-      <w:numFmt w:val="decimal"/>
-      <w:lvlText w:val=""/>
+    <w:lvl w:ilvl="3" w:tplc="73FE6A2C">
+      <w:start w:val="1"/>
+      <w:numFmt w:val="bullet"/>
+      <w:lvlText w:val="●"/>
       <w:lvlJc w:val="left"/>
+      <w:pPr>
+        <w:ind w:left="2880" w:hanging="360"/>
+      </w:pPr>
     </w:lvl>
-    <w:lvl w:ilvl="4" w:tplc="4870715A">
-      <w:numFmt w:val="decimal"/>
-      <w:lvlText w:val=""/>
+    <w:lvl w:ilvl="4" w:tplc="A1164A58">
+      <w:start w:val="1"/>
+      <w:numFmt w:val="bullet"/>
+      <w:lvlText w:val="○"/>
       <w:lvlJc w:val="left"/>
+      <w:pPr>
+        <w:ind w:left="3600" w:hanging="360"/>
+      </w:pPr>
     </w:lvl>
-    <w:lvl w:ilvl="5" w:tplc="F4B8BB6C">
-      <w:numFmt w:val="decimal"/>
-      <w:lvlText w:val=""/>
+    <w:lvl w:ilvl="5" w:tplc="A2400AE0">
+      <w:start w:val="1"/>
+      <w:numFmt w:val="bullet"/>
+      <w:lvlText w:val="■"/>
       <w:lvlJc w:val="left"/>
+      <w:pPr>
+        <w:ind w:left="4320" w:hanging="360"/>
+      </w:pPr>
     </w:lvl>
-    <w:lvl w:ilvl="6" w:tplc="A732C8D6">
-      <w:numFmt w:val="decimal"/>
-      <w:lvlText w:val=""/>
+    <w:lvl w:ilvl="6" w:tplc="832EF180">
+      <w:start w:val="1"/>
+      <w:numFmt w:val="bullet"/>
+      <w:lvlText w:val="●"/>
       <w:lvlJc w:val="left"/>
+      <w:pPr>
+        <w:ind w:left="5040" w:hanging="360"/>
+      </w:pPr>
     </w:lvl>
-    <w:lvl w:ilvl="7" w:tplc="42D2E1A8">
-      <w:numFmt w:val="decimal"/>
-      <w:lvlText w:val=""/>
+    <w:lvl w:ilvl="7" w:tplc="67046D02">
+      <w:start w:val="1"/>
+      <w:numFmt w:val="bullet"/>
+      <w:lvlText w:val="●"/>
       <w:lvlJc w:val="left"/>
+      <w:pPr>
+        <w:ind w:left="5760" w:hanging="360"/>
+      </w:pPr>
     </w:lvl>
-    <w:lvl w:ilvl="8" w:tplc="6F048F4E">
-      <w:numFmt w:val="decimal"/>
-      <w:lvlText w:val=""/>
+    <w:lvl w:ilvl="8" w:tplc="71BCA54A">
+      <w:start w:val="1"/>
+      <w:numFmt w:val="bullet"/>
+      <w:lvlText w:val="●"/>
       <w:lvlJc w:val="left"/>
+      <w:pPr>
+        <w:ind w:left="6480" w:hanging="360"/>
+      </w:pPr>
     </w:lvl>
   </w:abstractNum>
   <w:abstractNum w:abstractNumId="2" w15:restartNumberingAfterBreak="0">
-    <w:nsid w:val="71A51438"/>
+    <w:nsid w:val="63DD58D5"/>
     <w:multiLevelType w:val="hybridMultilevel"/>
-    <w:tmpl w:val="C6BA431E"/>
-    <w:lvl w:ilvl="0" w:tplc="3D1810CA">
+    <w:tmpl w:val="73947B52"/>
+    <w:lvl w:ilvl="0" w:tplc="64D4B6A8">
       <w:start w:val="1"/>
       <w:numFmt w:val="decimal"/>
       <w:lvlText w:val="%1."/>
@@ -14133,153 +14161,125 @@
         <w:color w:val="A67C27"/>
       </w:rPr>
     </w:lvl>
-    <w:lvl w:ilvl="1" w:tplc="7D16186E">
+    <w:lvl w:ilvl="1" w:tplc="C52CCF92">
       <w:numFmt w:val="decimal"/>
       <w:lvlText w:val=""/>
       <w:lvlJc w:val="left"/>
     </w:lvl>
-    <w:lvl w:ilvl="2" w:tplc="A37EC190">
+    <w:lvl w:ilvl="2" w:tplc="97F28D2A">
       <w:numFmt w:val="decimal"/>
       <w:lvlText w:val=""/>
       <w:lvlJc w:val="left"/>
     </w:lvl>
-    <w:lvl w:ilvl="3" w:tplc="59D01AA2">
+    <w:lvl w:ilvl="3" w:tplc="304C41D2">
       <w:numFmt w:val="decimal"/>
       <w:lvlText w:val=""/>
       <w:lvlJc w:val="left"/>
     </w:lvl>
-    <w:lvl w:ilvl="4" w:tplc="1E1A1BB8">
+    <w:lvl w:ilvl="4" w:tplc="8C9E2302">
       <w:numFmt w:val="decimal"/>
       <w:lvlText w:val=""/>
       <w:lvlJc w:val="left"/>
     </w:lvl>
-    <w:lvl w:ilvl="5" w:tplc="B60A31D4">
+    <w:lvl w:ilvl="5" w:tplc="7FFA1F20">
       <w:numFmt w:val="decimal"/>
       <w:lvlText w:val=""/>
       <w:lvlJc w:val="left"/>
     </w:lvl>
-    <w:lvl w:ilvl="6" w:tplc="EB92C6E4">
+    <w:lvl w:ilvl="6" w:tplc="7DD012A2">
       <w:numFmt w:val="decimal"/>
       <w:lvlText w:val=""/>
       <w:lvlJc w:val="left"/>
     </w:lvl>
-    <w:lvl w:ilvl="7" w:tplc="C06EC260">
+    <w:lvl w:ilvl="7" w:tplc="2EEEB100">
       <w:numFmt w:val="decimal"/>
       <w:lvlText w:val=""/>
       <w:lvlJc w:val="left"/>
     </w:lvl>
-    <w:lvl w:ilvl="8" w:tplc="8996DC38">
+    <w:lvl w:ilvl="8" w:tplc="E1143D98">
       <w:numFmt w:val="decimal"/>
       <w:lvlText w:val=""/>
       <w:lvlJc w:val="left"/>
     </w:lvl>
   </w:abstractNum>
   <w:abstractNum w:abstractNumId="3" w15:restartNumberingAfterBreak="0">
-    <w:nsid w:val="776D58D9"/>
+    <w:nsid w:val="7EE02045"/>
     <w:multiLevelType w:val="hybridMultilevel"/>
-    <w:tmpl w:val="AB8A69CC"/>
-    <w:lvl w:ilvl="0" w:tplc="2F54FD12">
+    <w:tmpl w:val="7A7C6190"/>
+    <w:lvl w:ilvl="0" w:tplc="5AB08738">
       <w:start w:val="1"/>
       <w:numFmt w:val="bullet"/>
-      <w:lvlText w:val="●"/>
+      <w:lvlText w:val="•"/>
       <w:lvlJc w:val="left"/>
       <w:pPr>
-        <w:ind w:left="720" w:hanging="360"/>
+        <w:ind w:left="460" w:hanging="280"/>
       </w:pPr>
     </w:lvl>
-    <w:lvl w:ilvl="1" w:tplc="262CC8E0">
+    <w:lvl w:ilvl="1" w:tplc="D03622E4">
       <w:start w:val="1"/>
       <w:numFmt w:val="bullet"/>
-      <w:lvlText w:val="○"/>
+      <w:lvlText w:val="–"/>
       <w:lvlJc w:val="left"/>
       <w:pPr>
-        <w:ind w:left="1440" w:hanging="360"/>
+        <w:ind w:left="900" w:hanging="280"/>
       </w:pPr>
     </w:lvl>
-    <w:lvl w:ilvl="2" w:tplc="D5FA8E7C">
-      <w:start w:val="1"/>
-      <w:numFmt w:val="bullet"/>
-      <w:lvlText w:val="■"/>
+    <w:lvl w:ilvl="2" w:tplc="DE18C052">
+      <w:numFmt w:val="decimal"/>
+      <w:lvlText w:val=""/>
       <w:lvlJc w:val="left"/>
-      <w:pPr>
-        <w:ind w:left="2160" w:hanging="360"/>
-      </w:pPr>
     </w:lvl>
-    <w:lvl w:ilvl="3" w:tplc="9D881590">
-      <w:start w:val="1"/>
-      <w:numFmt w:val="bullet"/>
-      <w:lvlText w:val="●"/>
+    <w:lvl w:ilvl="3" w:tplc="AFDABD34">
+      <w:numFmt w:val="decimal"/>
+      <w:lvlText w:val=""/>
       <w:lvlJc w:val="left"/>
-      <w:pPr>
-        <w:ind w:left="2880" w:hanging="360"/>
-      </w:pPr>
     </w:lvl>
-    <w:lvl w:ilvl="4" w:tplc="92AC7AF2">
-      <w:start w:val="1"/>
-      <w:numFmt w:val="bullet"/>
-      <w:lvlText w:val="○"/>
+    <w:lvl w:ilvl="4" w:tplc="2F02A990">
+      <w:numFmt w:val="decimal"/>
+      <w:lvlText w:val=""/>
       <w:lvlJc w:val="left"/>
-      <w:pPr>
-        <w:ind w:left="3600" w:hanging="360"/>
-      </w:pPr>
     </w:lvl>
-    <w:lvl w:ilvl="5" w:tplc="35067C12">
-      <w:start w:val="1"/>
-      <w:numFmt w:val="bullet"/>
-      <w:lvlText w:val="■"/>
+    <w:lvl w:ilvl="5" w:tplc="85884386">
+      <w:numFmt w:val="decimal"/>
+      <w:lvlText w:val=""/>
       <w:lvlJc w:val="left"/>
-      <w:pPr>
-        <w:ind w:left="4320" w:hanging="360"/>
-      </w:pPr>
     </w:lvl>
-    <w:lvl w:ilvl="6" w:tplc="46824594">
-      <w:start w:val="1"/>
-      <w:numFmt w:val="bullet"/>
-      <w:lvlText w:val="●"/>
+    <w:lvl w:ilvl="6" w:tplc="C1EC0A8C">
+      <w:numFmt w:val="decimal"/>
+      <w:lvlText w:val=""/>
       <w:lvlJc w:val="left"/>
-      <w:pPr>
-        <w:ind w:left="5040" w:hanging="360"/>
-      </w:pPr>
     </w:lvl>
-    <w:lvl w:ilvl="7" w:tplc="C53874E0">
-      <w:start w:val="1"/>
-      <w:numFmt w:val="bullet"/>
-      <w:lvlText w:val="●"/>
+    <w:lvl w:ilvl="7" w:tplc="DAA0E57E">
+      <w:numFmt w:val="decimal"/>
+      <w:lvlText w:val=""/>
       <w:lvlJc w:val="left"/>
-      <w:pPr>
-        <w:ind w:left="5760" w:hanging="360"/>
-      </w:pPr>
     </w:lvl>
-    <w:lvl w:ilvl="8" w:tplc="2C9E23F8">
-      <w:start w:val="1"/>
-      <w:numFmt w:val="bullet"/>
-      <w:lvlText w:val="●"/>
+    <w:lvl w:ilvl="8" w:tplc="B8C29758">
+      <w:numFmt w:val="decimal"/>
+      <w:lvlText w:val=""/>
       <w:lvlJc w:val="left"/>
-      <w:pPr>
-        <w:ind w:left="6480" w:hanging="360"/>
-      </w:pPr>
     </w:lvl>
   </w:abstractNum>
-  <w:num w:numId="1" w16cid:durableId="214390353">
+  <w:num w:numId="1" w16cid:durableId="301157910">
+    <w:abstractNumId w:val="1"/>
+    <w:lvlOverride w:ilvl="0">
+      <w:startOverride w:val="1"/>
+    </w:lvlOverride>
+  </w:num>
+  <w:num w:numId="2" w16cid:durableId="1843154885">
     <w:abstractNumId w:val="3"/>
     <w:lvlOverride w:ilvl="0">
       <w:startOverride w:val="1"/>
     </w:lvlOverride>
   </w:num>
-  <w:num w:numId="2" w16cid:durableId="1573664441">
-    <w:abstractNumId w:val="1"/>
+  <w:num w:numId="3" w16cid:durableId="836650730">
+    <w:abstractNumId w:val="2"/>
     <w:lvlOverride w:ilvl="0">
       <w:startOverride w:val="1"/>
     </w:lvlOverride>
   </w:num>
-  <w:num w:numId="3" w16cid:durableId="235751959">
+  <w:num w:numId="4" w16cid:durableId="1378580123">
     <w:abstractNumId w:val="0"/>
-    <w:lvlOverride w:ilvl="0">
-      <w:startOverride w:val="1"/>
-    </w:lvlOverride>
-  </w:num>
-  <w:num w:numId="4" w16cid:durableId="150948302">
-    <w:abstractNumId w:val="2"/>
     <w:lvlOverride w:ilvl="0">
       <w:startOverride w:val="1"/>
     </w:lvlOverride>
@@ -14904,7 +14904,7 @@
     <w:autoRedefine/>
     <w:uiPriority w:val="39"/>
     <w:unhideWhenUsed/>
-    <w:rsid w:val="007C4033"/>
+    <w:rsid w:val="00913645"/>
     <w:pPr>
       <w:spacing w:after="100"/>
     </w:pPr>
@@ -14916,7 +14916,7 @@
     <w:autoRedefine/>
     <w:uiPriority w:val="39"/>
     <w:unhideWhenUsed/>
-    <w:rsid w:val="007C4033"/>
+    <w:rsid w:val="00913645"/>
     <w:pPr>
       <w:spacing w:after="100"/>
       <w:ind w:left="210"/>

</xml_diff>

<commit_message>
feat: Copy for another chapter; dedicated Form PDFs screenshots for KII and Documentary RA guides; manuals v1.5
Co-Authored-By: Claude Sonnet 5 <noreply@anthropic.com>
</commit_message>
<xml_diff>
--- a/docs/manuals/RA_Training_Programme_and_Facilitator_Guide.docx
+++ b/docs/manuals/RA_Training_Programme_and_Facilitator_Guide.docx
@@ -469,7 +469,7 @@
                 <w:sz w:val="19"/>
                 <w:szCs w:val="19"/>
               </w:rPr>
-              <w:t>Version 1.4 · 20 September 2026</w:t>
+              <w:t>Version 1.5 · 20 September 2026</w:t>
             </w:r>
           </w:p>
         </w:tc>
@@ -538,7 +538,7 @@
     <w:sdt>
       <w:sdtPr>
         <w:alias w:val="Contents"/>
-        <w:id w:val="-482318670"/>
+        <w:id w:val="527917182"/>
       </w:sdtPr>
       <w:sdtEndPr/>
       <w:sdtContent>
@@ -567,7 +567,7 @@
           <w:r>
             <w:fldChar w:fldCharType="separate"/>
           </w:r>
-          <w:hyperlink w:anchor="_Toc240773228" w:history="1">
+          <w:hyperlink w:anchor="_Toc240779410" w:history="1">
             <w:r>
               <w:rPr>
                 <w:rStyle w:val="Hyperlink"/>
@@ -591,7 +591,7 @@
               <w:rPr>
                 <w:noProof/>
               </w:rPr>
-              <w:instrText xml:space="preserve"> PAGEREF _Toc240773228 \h </w:instrText>
+              <w:instrText xml:space="preserve"> PAGEREF _Toc240779410 \h </w:instrText>
             </w:r>
             <w:r>
               <w:rPr>
@@ -634,7 +634,7 @@
               <w14:ligatures w14:val="standardContextual"/>
             </w:rPr>
           </w:pPr>
-          <w:hyperlink w:anchor="_Toc240773229" w:history="1">
+          <w:hyperlink w:anchor="_Toc240779411" w:history="1">
             <w:r>
               <w:rPr>
                 <w:rStyle w:val="Hyperlink"/>
@@ -658,7 +658,7 @@
               <w:rPr>
                 <w:noProof/>
               </w:rPr>
-              <w:instrText xml:space="preserve"> PAGEREF _Toc240773229 \h </w:instrText>
+              <w:instrText xml:space="preserve"> PAGEREF _Toc240779411 \h </w:instrText>
             </w:r>
             <w:r>
               <w:rPr>
@@ -701,7 +701,7 @@
               <w14:ligatures w14:val="standardContextual"/>
             </w:rPr>
           </w:pPr>
-          <w:hyperlink w:anchor="_Toc240773230" w:history="1">
+          <w:hyperlink w:anchor="_Toc240779412" w:history="1">
             <w:r>
               <w:rPr>
                 <w:rStyle w:val="Hyperlink"/>
@@ -725,7 +725,7 @@
               <w:rPr>
                 <w:noProof/>
               </w:rPr>
-              <w:instrText xml:space="preserve"> PAGEREF _Toc240773230 \h </w:instrText>
+              <w:instrText xml:space="preserve"> PAGEREF _Toc240779412 \h </w:instrText>
             </w:r>
             <w:r>
               <w:rPr>
@@ -768,7 +768,7 @@
               <w14:ligatures w14:val="standardContextual"/>
             </w:rPr>
           </w:pPr>
-          <w:hyperlink w:anchor="_Toc240773231" w:history="1">
+          <w:hyperlink w:anchor="_Toc240779413" w:history="1">
             <w:r>
               <w:rPr>
                 <w:rStyle w:val="Hyperlink"/>
@@ -792,7 +792,7 @@
               <w:rPr>
                 <w:noProof/>
               </w:rPr>
-              <w:instrText xml:space="preserve"> PAGEREF _Toc240773231 \h </w:instrText>
+              <w:instrText xml:space="preserve"> PAGEREF _Toc240779413 \h </w:instrText>
             </w:r>
             <w:r>
               <w:rPr>
@@ -835,7 +835,7 @@
               <w14:ligatures w14:val="standardContextual"/>
             </w:rPr>
           </w:pPr>
-          <w:hyperlink w:anchor="_Toc240773232" w:history="1">
+          <w:hyperlink w:anchor="_Toc240779414" w:history="1">
             <w:r>
               <w:rPr>
                 <w:rStyle w:val="Hyperlink"/>
@@ -859,7 +859,7 @@
               <w:rPr>
                 <w:noProof/>
               </w:rPr>
-              <w:instrText xml:space="preserve"> PAGEREF _Toc240773232 \h </w:instrText>
+              <w:instrText xml:space="preserve"> PAGEREF _Toc240779414 \h </w:instrText>
             </w:r>
             <w:r>
               <w:rPr>
@@ -902,7 +902,7 @@
               <w14:ligatures w14:val="standardContextual"/>
             </w:rPr>
           </w:pPr>
-          <w:hyperlink w:anchor="_Toc240773233" w:history="1">
+          <w:hyperlink w:anchor="_Toc240779415" w:history="1">
             <w:r>
               <w:rPr>
                 <w:rStyle w:val="Hyperlink"/>
@@ -926,7 +926,7 @@
               <w:rPr>
                 <w:noProof/>
               </w:rPr>
-              <w:instrText xml:space="preserve"> PAGEREF _Toc240773233 \h </w:instrText>
+              <w:instrText xml:space="preserve"> PAGEREF _Toc240779415 \h </w:instrText>
             </w:r>
             <w:r>
               <w:rPr>
@@ -969,7 +969,7 @@
               <w14:ligatures w14:val="standardContextual"/>
             </w:rPr>
           </w:pPr>
-          <w:hyperlink w:anchor="_Toc240773234" w:history="1">
+          <w:hyperlink w:anchor="_Toc240779416" w:history="1">
             <w:r>
               <w:rPr>
                 <w:rStyle w:val="Hyperlink"/>
@@ -993,7 +993,7 @@
               <w:rPr>
                 <w:noProof/>
               </w:rPr>
-              <w:instrText xml:space="preserve"> PAGEREF _Toc240773234 \h </w:instrText>
+              <w:instrText xml:space="preserve"> PAGEREF _Toc240779416 \h </w:instrText>
             </w:r>
             <w:r>
               <w:rPr>
@@ -1036,7 +1036,7 @@
               <w14:ligatures w14:val="standardContextual"/>
             </w:rPr>
           </w:pPr>
-          <w:hyperlink w:anchor="_Toc240773235" w:history="1">
+          <w:hyperlink w:anchor="_Toc240779417" w:history="1">
             <w:r>
               <w:rPr>
                 <w:rStyle w:val="Hyperlink"/>
@@ -1060,7 +1060,7 @@
               <w:rPr>
                 <w:noProof/>
               </w:rPr>
-              <w:instrText xml:space="preserve"> PAGEREF _Toc240773235 \h </w:instrText>
+              <w:instrText xml:space="preserve"> PAGEREF _Toc240779417 \h </w:instrText>
             </w:r>
             <w:r>
               <w:rPr>
@@ -1103,7 +1103,7 @@
               <w14:ligatures w14:val="standardContextual"/>
             </w:rPr>
           </w:pPr>
-          <w:hyperlink w:anchor="_Toc240773236" w:history="1">
+          <w:hyperlink w:anchor="_Toc240779418" w:history="1">
             <w:r>
               <w:rPr>
                 <w:rStyle w:val="Hyperlink"/>
@@ -1127,7 +1127,7 @@
               <w:rPr>
                 <w:noProof/>
               </w:rPr>
-              <w:instrText xml:space="preserve"> PAGEREF _Toc240773236 \h </w:instrText>
+              <w:instrText xml:space="preserve"> PAGEREF _Toc240779418 \h </w:instrText>
             </w:r>
             <w:r>
               <w:rPr>
@@ -1170,7 +1170,7 @@
               <w14:ligatures w14:val="standardContextual"/>
             </w:rPr>
           </w:pPr>
-          <w:hyperlink w:anchor="_Toc240773237" w:history="1">
+          <w:hyperlink w:anchor="_Toc240779419" w:history="1">
             <w:r>
               <w:rPr>
                 <w:rStyle w:val="Hyperlink"/>
@@ -1194,7 +1194,7 @@
               <w:rPr>
                 <w:noProof/>
               </w:rPr>
-              <w:instrText xml:space="preserve"> PAGEREF _Toc240773237 \h </w:instrText>
+              <w:instrText xml:space="preserve"> PAGEREF _Toc240779419 \h </w:instrText>
             </w:r>
             <w:r>
               <w:rPr>
@@ -1237,7 +1237,7 @@
               <w14:ligatures w14:val="standardContextual"/>
             </w:rPr>
           </w:pPr>
-          <w:hyperlink w:anchor="_Toc240773238" w:history="1">
+          <w:hyperlink w:anchor="_Toc240779420" w:history="1">
             <w:r>
               <w:rPr>
                 <w:rStyle w:val="Hyperlink"/>
@@ -1261,7 +1261,7 @@
               <w:rPr>
                 <w:noProof/>
               </w:rPr>
-              <w:instrText xml:space="preserve"> PAGEREF _Toc240773238 \h </w:instrText>
+              <w:instrText xml:space="preserve"> PAGEREF _Toc240779420 \h </w:instrText>
             </w:r>
             <w:r>
               <w:rPr>
@@ -1304,7 +1304,7 @@
               <w14:ligatures w14:val="standardContextual"/>
             </w:rPr>
           </w:pPr>
-          <w:hyperlink w:anchor="_Toc240773239" w:history="1">
+          <w:hyperlink w:anchor="_Toc240779421" w:history="1">
             <w:r>
               <w:rPr>
                 <w:rStyle w:val="Hyperlink"/>
@@ -1328,7 +1328,7 @@
               <w:rPr>
                 <w:noProof/>
               </w:rPr>
-              <w:instrText xml:space="preserve"> PAGEREF _Toc240773239 \h </w:instrText>
+              <w:instrText xml:space="preserve"> PAGEREF _Toc240779421 \h </w:instrText>
             </w:r>
             <w:r>
               <w:rPr>
@@ -1371,7 +1371,7 @@
               <w14:ligatures w14:val="standardContextual"/>
             </w:rPr>
           </w:pPr>
-          <w:hyperlink w:anchor="_Toc240773240" w:history="1">
+          <w:hyperlink w:anchor="_Toc240779422" w:history="1">
             <w:r>
               <w:rPr>
                 <w:rStyle w:val="Hyperlink"/>
@@ -1395,7 +1395,7 @@
               <w:rPr>
                 <w:noProof/>
               </w:rPr>
-              <w:instrText xml:space="preserve"> PAGEREF _Toc240773240 \h </w:instrText>
+              <w:instrText xml:space="preserve"> PAGEREF _Toc240779422 \h </w:instrText>
             </w:r>
             <w:r>
               <w:rPr>
@@ -1438,7 +1438,7 @@
               <w14:ligatures w14:val="standardContextual"/>
             </w:rPr>
           </w:pPr>
-          <w:hyperlink w:anchor="_Toc240773241" w:history="1">
+          <w:hyperlink w:anchor="_Toc240779423" w:history="1">
             <w:r>
               <w:rPr>
                 <w:rStyle w:val="Hyperlink"/>
@@ -1462,7 +1462,7 @@
               <w:rPr>
                 <w:noProof/>
               </w:rPr>
-              <w:instrText xml:space="preserve"> PAGEREF _Toc240773241 \h </w:instrText>
+              <w:instrText xml:space="preserve"> PAGEREF _Toc240779423 \h </w:instrText>
             </w:r>
             <w:r>
               <w:rPr>
@@ -1505,7 +1505,7 @@
               <w14:ligatures w14:val="standardContextual"/>
             </w:rPr>
           </w:pPr>
-          <w:hyperlink w:anchor="_Toc240773242" w:history="1">
+          <w:hyperlink w:anchor="_Toc240779424" w:history="1">
             <w:r>
               <w:rPr>
                 <w:rStyle w:val="Hyperlink"/>
@@ -1529,7 +1529,7 @@
               <w:rPr>
                 <w:noProof/>
               </w:rPr>
-              <w:instrText xml:space="preserve"> PAGEREF _Toc240773242 \h </w:instrText>
+              <w:instrText xml:space="preserve"> PAGEREF _Toc240779424 \h </w:instrText>
             </w:r>
             <w:r>
               <w:rPr>
@@ -1572,7 +1572,7 @@
               <w14:ligatures w14:val="standardContextual"/>
             </w:rPr>
           </w:pPr>
-          <w:hyperlink w:anchor="_Toc240773243" w:history="1">
+          <w:hyperlink w:anchor="_Toc240779425" w:history="1">
             <w:r>
               <w:rPr>
                 <w:rStyle w:val="Hyperlink"/>
@@ -1596,7 +1596,7 @@
               <w:rPr>
                 <w:noProof/>
               </w:rPr>
-              <w:instrText xml:space="preserve"> PAGEREF _Toc240773243 \h </w:instrText>
+              <w:instrText xml:space="preserve"> PAGEREF _Toc240779425 \h </w:instrText>
             </w:r>
             <w:r>
               <w:rPr>
@@ -1639,7 +1639,7 @@
               <w14:ligatures w14:val="standardContextual"/>
             </w:rPr>
           </w:pPr>
-          <w:hyperlink w:anchor="_Toc240773244" w:history="1">
+          <w:hyperlink w:anchor="_Toc240779426" w:history="1">
             <w:r>
               <w:rPr>
                 <w:rStyle w:val="Hyperlink"/>
@@ -1663,7 +1663,7 @@
               <w:rPr>
                 <w:noProof/>
               </w:rPr>
-              <w:instrText xml:space="preserve"> PAGEREF _Toc240773244 \h </w:instrText>
+              <w:instrText xml:space="preserve"> PAGEREF _Toc240779426 \h </w:instrText>
             </w:r>
             <w:r>
               <w:rPr>
@@ -1706,7 +1706,7 @@
               <w14:ligatures w14:val="standardContextual"/>
             </w:rPr>
           </w:pPr>
-          <w:hyperlink w:anchor="_Toc240773245" w:history="1">
+          <w:hyperlink w:anchor="_Toc240779427" w:history="1">
             <w:r>
               <w:rPr>
                 <w:rStyle w:val="Hyperlink"/>
@@ -1730,7 +1730,7 @@
               <w:rPr>
                 <w:noProof/>
               </w:rPr>
-              <w:instrText xml:space="preserve"> PAGEREF _Toc240773245 \h </w:instrText>
+              <w:instrText xml:space="preserve"> PAGEREF _Toc240779427 \h </w:instrText>
             </w:r>
             <w:r>
               <w:rPr>
@@ -1773,7 +1773,7 @@
               <w14:ligatures w14:val="standardContextual"/>
             </w:rPr>
           </w:pPr>
-          <w:hyperlink w:anchor="_Toc240773246" w:history="1">
+          <w:hyperlink w:anchor="_Toc240779428" w:history="1">
             <w:r>
               <w:rPr>
                 <w:rStyle w:val="Hyperlink"/>
@@ -1797,7 +1797,7 @@
               <w:rPr>
                 <w:noProof/>
               </w:rPr>
-              <w:instrText xml:space="preserve"> PAGEREF _Toc240773246 \h </w:instrText>
+              <w:instrText xml:space="preserve"> PAGEREF _Toc240779428 \h </w:instrText>
             </w:r>
             <w:r>
               <w:rPr>
@@ -1840,7 +1840,7 @@
               <w14:ligatures w14:val="standardContextual"/>
             </w:rPr>
           </w:pPr>
-          <w:hyperlink w:anchor="_Toc240773247" w:history="1">
+          <w:hyperlink w:anchor="_Toc240779429" w:history="1">
             <w:r>
               <w:rPr>
                 <w:rStyle w:val="Hyperlink"/>
@@ -1864,7 +1864,7 @@
               <w:rPr>
                 <w:noProof/>
               </w:rPr>
-              <w:instrText xml:space="preserve"> PAGEREF _Toc240773247 \h </w:instrText>
+              <w:instrText xml:space="preserve"> PAGEREF _Toc240779429 \h </w:instrText>
             </w:r>
             <w:r>
               <w:rPr>
@@ -1907,7 +1907,7 @@
               <w14:ligatures w14:val="standardContextual"/>
             </w:rPr>
           </w:pPr>
-          <w:hyperlink w:anchor="_Toc240773248" w:history="1">
+          <w:hyperlink w:anchor="_Toc240779430" w:history="1">
             <w:r>
               <w:rPr>
                 <w:rStyle w:val="Hyperlink"/>
@@ -1931,7 +1931,7 @@
               <w:rPr>
                 <w:noProof/>
               </w:rPr>
-              <w:instrText xml:space="preserve"> PAGEREF _Toc240773248 \h </w:instrText>
+              <w:instrText xml:space="preserve"> PAGEREF _Toc240779430 \h </w:instrText>
             </w:r>
             <w:r>
               <w:rPr>
@@ -1974,7 +1974,7 @@
               <w14:ligatures w14:val="standardContextual"/>
             </w:rPr>
           </w:pPr>
-          <w:hyperlink w:anchor="_Toc240773249" w:history="1">
+          <w:hyperlink w:anchor="_Toc240779431" w:history="1">
             <w:r>
               <w:rPr>
                 <w:rStyle w:val="Hyperlink"/>
@@ -1998,7 +1998,7 @@
               <w:rPr>
                 <w:noProof/>
               </w:rPr>
-              <w:instrText xml:space="preserve"> PAGEREF _Toc240773249 \h </w:instrText>
+              <w:instrText xml:space="preserve"> PAGEREF _Toc240779431 \h </w:instrText>
             </w:r>
             <w:r>
               <w:rPr>
@@ -2041,7 +2041,7 @@
               <w14:ligatures w14:val="standardContextual"/>
             </w:rPr>
           </w:pPr>
-          <w:hyperlink w:anchor="_Toc240773250" w:history="1">
+          <w:hyperlink w:anchor="_Toc240779432" w:history="1">
             <w:r>
               <w:rPr>
                 <w:rStyle w:val="Hyperlink"/>
@@ -2065,7 +2065,7 @@
               <w:rPr>
                 <w:noProof/>
               </w:rPr>
-              <w:instrText xml:space="preserve"> PAGEREF _Toc240773250 \h </w:instrText>
+              <w:instrText xml:space="preserve"> PAGEREF _Toc240779432 \h </w:instrText>
             </w:r>
             <w:r>
               <w:rPr>
@@ -2108,7 +2108,7 @@
               <w14:ligatures w14:val="standardContextual"/>
             </w:rPr>
           </w:pPr>
-          <w:hyperlink w:anchor="_Toc240773251" w:history="1">
+          <w:hyperlink w:anchor="_Toc240779433" w:history="1">
             <w:r>
               <w:rPr>
                 <w:rStyle w:val="Hyperlink"/>
@@ -2132,7 +2132,7 @@
               <w:rPr>
                 <w:noProof/>
               </w:rPr>
-              <w:instrText xml:space="preserve"> PAGEREF _Toc240773251 \h </w:instrText>
+              <w:instrText xml:space="preserve"> PAGEREF _Toc240779433 \h </w:instrText>
             </w:r>
             <w:r>
               <w:rPr>
@@ -2171,7 +2171,7 @@
         <w:pStyle w:val="Heading1"/>
         <w:pageBreakBefore/>
       </w:pPr>
-      <w:bookmarkStart w:id="0" w:name="_Toc240773228"/>
+      <w:bookmarkStart w:id="0" w:name="_Toc240779410"/>
       <w:r>
         <w:lastRenderedPageBreak/>
         <w:t>1. Programme overview</w:t>
@@ -2577,7 +2577,7 @@
       <w:pPr>
         <w:pStyle w:val="Heading2"/>
       </w:pPr>
-      <w:bookmarkStart w:id="1" w:name="_Toc240773229"/>
+      <w:bookmarkStart w:id="1" w:name="_Toc240779411"/>
       <w:r>
         <w:t>1.1 Learning objectives</w:t>
       </w:r>
@@ -2678,7 +2678,7 @@
       <w:pPr>
         <w:pStyle w:val="Heading2"/>
       </w:pPr>
-      <w:bookmarkStart w:id="2" w:name="_Toc240773230"/>
+      <w:bookmarkStart w:id="2" w:name="_Toc240779412"/>
       <w:r>
         <w:t>1.2 Before the training (facilitator checklist)</w:t>
       </w:r>
@@ -3214,7 +3214,7 @@
       <w:pPr>
         <w:pStyle w:val="Heading2"/>
       </w:pPr>
-      <w:bookmarkStart w:id="3" w:name="_Toc240773231"/>
+      <w:bookmarkStart w:id="3" w:name="_Toc240779413"/>
       <w:r>
         <w:t>1.3 The practice environment</w:t>
       </w:r>
@@ -3360,7 +3360,7 @@
         <w:pStyle w:val="Heading1"/>
         <w:pageBreakBefore/>
       </w:pPr>
-      <w:bookmarkStart w:id="4" w:name="_Toc240773232"/>
+      <w:bookmarkStart w:id="4" w:name="_Toc240779414"/>
       <w:r>
         <w:lastRenderedPageBreak/>
         <w:t>2. Schedule</w:t>
@@ -3371,7 +3371,7 @@
       <w:pPr>
         <w:pStyle w:val="Heading2"/>
       </w:pPr>
-      <w:bookmarkStart w:id="5" w:name="_Toc240773233"/>
+      <w:bookmarkStart w:id="5" w:name="_Toc240779415"/>
       <w:r>
         <w:t>Day 1 — Foundations (all RAs)</w:t>
       </w:r>
@@ -4654,7 +4654,7 @@
       <w:pPr>
         <w:pStyle w:val="Heading2"/>
       </w:pPr>
-      <w:bookmarkStart w:id="6" w:name="_Toc240773234"/>
+      <w:bookmarkStart w:id="6" w:name="_Toc240779416"/>
       <w:r>
         <w:t>Day 2 — Role tracks</w:t>
       </w:r>
@@ -6182,7 +6182,7 @@
       <w:pPr>
         <w:pStyle w:val="Heading2"/>
       </w:pPr>
-      <w:bookmarkStart w:id="7" w:name="_Toc240773235"/>
+      <w:bookmarkStart w:id="7" w:name="_Toc240779417"/>
       <w:r>
         <w:t>Day 3 — Practice and assessment</w:t>
       </w:r>
@@ -7152,7 +7152,7 @@
       <w:pPr>
         <w:pStyle w:val="Heading2"/>
       </w:pPr>
-      <w:bookmarkStart w:id="8" w:name="_Toc240773236"/>
+      <w:bookmarkStart w:id="8" w:name="_Toc240779418"/>
       <w:r>
         <w:t>After the training</w:t>
       </w:r>
@@ -7487,7 +7487,7 @@
         <w:pStyle w:val="Heading1"/>
         <w:pageBreakBefore/>
       </w:pPr>
-      <w:bookmarkStart w:id="9" w:name="_Toc240773237"/>
+      <w:bookmarkStart w:id="9" w:name="_Toc240779419"/>
       <w:r>
         <w:lastRenderedPageBreak/>
         <w:t>3. Session plans</w:t>
@@ -7506,7 +7506,7 @@
       <w:pPr>
         <w:pStyle w:val="Heading2"/>
       </w:pPr>
-      <w:bookmarkStart w:id="10" w:name="_Toc240773238"/>
+      <w:bookmarkStart w:id="10" w:name="_Toc240779420"/>
       <w:r>
         <w:t>Module 1 — The study (60 min)</w:t>
       </w:r>
@@ -7601,7 +7601,7 @@
       <w:pPr>
         <w:pStyle w:val="Heading2"/>
       </w:pPr>
-      <w:bookmarkStart w:id="11" w:name="_Toc240773239"/>
+      <w:bookmarkStart w:id="11" w:name="_Toc240779421"/>
       <w:r>
         <w:t>Module 2 — Research ethics and consent (60 min)</w:t>
       </w:r>
@@ -7696,7 +7696,7 @@
       <w:pPr>
         <w:pStyle w:val="Heading2"/>
       </w:pPr>
-      <w:bookmarkStart w:id="12" w:name="_Toc240773240"/>
+      <w:bookmarkStart w:id="12" w:name="_Toc240779422"/>
       <w:r>
         <w:t>Module 3 — Data protection (60 min)</w:t>
       </w:r>
@@ -7791,7 +7791,7 @@
       <w:pPr>
         <w:pStyle w:val="Heading2"/>
       </w:pPr>
-      <w:bookmarkStart w:id="13" w:name="_Toc240773241"/>
+      <w:bookmarkStart w:id="13" w:name="_Toc240779423"/>
       <w:r>
         <w:t>Module 5 — The portal (75 min)</w:t>
       </w:r>
@@ -7886,7 +7886,7 @@
       <w:pPr>
         <w:pStyle w:val="Heading2"/>
       </w:pPr>
-      <w:bookmarkStart w:id="14" w:name="_Toc240773242"/>
+      <w:bookmarkStart w:id="14" w:name="_Toc240779424"/>
       <w:r>
         <w:t>Module 6 — The respondent journey (45 min)</w:t>
       </w:r>
@@ -7982,7 +7982,7 @@
       <w:pPr>
         <w:pStyle w:val="Heading2"/>
       </w:pPr>
-      <w:bookmarkStart w:id="15" w:name="_Toc240773243"/>
+      <w:bookmarkStart w:id="15" w:name="_Toc240779425"/>
       <w:r>
         <w:t>Module 8 — Communication skills (90 min)</w:t>
       </w:r>
@@ -8077,7 +8077,7 @@
       <w:pPr>
         <w:pStyle w:val="Heading2"/>
       </w:pPr>
-      <w:bookmarkStart w:id="16" w:name="_Toc240773244"/>
+      <w:bookmarkStart w:id="16" w:name="_Toc240779426"/>
       <w:r>
         <w:t>Module 9 — Quality judgement (90 min)</w:t>
       </w:r>
@@ -8173,7 +8173,7 @@
         <w:pStyle w:val="Heading1"/>
         <w:pageBreakBefore/>
       </w:pPr>
-      <w:bookmarkStart w:id="17" w:name="_Toc240773245"/>
+      <w:bookmarkStart w:id="17" w:name="_Toc240779427"/>
       <w:r>
         <w:lastRenderedPageBreak/>
         <w:t>4. Role-plays and simulation</w:t>
@@ -9127,7 +9127,7 @@
       <w:pPr>
         <w:pStyle w:val="Heading2"/>
       </w:pPr>
-      <w:bookmarkStart w:id="18" w:name="_Toc240773246"/>
+      <w:bookmarkStart w:id="18" w:name="_Toc240779428"/>
       <w:r>
         <w:t>Field simulation (Day 3)</w:t>
       </w:r>
@@ -9222,7 +9222,7 @@
         <w:pStyle w:val="Heading1"/>
         <w:pageBreakBefore/>
       </w:pPr>
-      <w:bookmarkStart w:id="19" w:name="_Toc240773247"/>
+      <w:bookmarkStart w:id="19" w:name="_Toc240779429"/>
       <w:r>
         <w:lastRenderedPageBreak/>
         <w:t>5. Assessment and certification</w:t>
@@ -9233,7 +9233,7 @@
       <w:pPr>
         <w:pStyle w:val="Heading2"/>
       </w:pPr>
-      <w:bookmarkStart w:id="20" w:name="_Toc240773248"/>
+      <w:bookmarkStart w:id="20" w:name="_Toc240779430"/>
       <w:r>
         <w:t>5.1 Competencies</w:t>
       </w:r>
@@ -9624,7 +9624,7 @@
       <w:pPr>
         <w:pStyle w:val="Heading2"/>
       </w:pPr>
-      <w:bookmarkStart w:id="21" w:name="_Toc240773249"/>
+      <w:bookmarkStart w:id="21" w:name="_Toc240779431"/>
       <w:r>
         <w:t>5.2 Written assessment (answer key)</w:t>
       </w:r>
@@ -10984,7 +10984,7 @@
       <w:pPr>
         <w:pStyle w:val="Heading2"/>
       </w:pPr>
-      <w:bookmarkStart w:id="22" w:name="_Toc240773250"/>
+      <w:bookmarkStart w:id="22" w:name="_Toc240779432"/>
       <w:r>
         <w:t>5.3 Practical assessment</w:t>
       </w:r>
@@ -12247,7 +12247,7 @@
         <w:pStyle w:val="Heading1"/>
         <w:pageBreakBefore/>
       </w:pPr>
-      <w:bookmarkStart w:id="23" w:name="_Toc240773251"/>
+      <w:bookmarkStart w:id="23" w:name="_Toc240779433"/>
       <w:r>
         <w:lastRenderedPageBreak/>
         <w:t>6. Attendance register</w:t>
@@ -13826,7 +13826,7 @@
         <w:sz w:val="16"/>
         <w:szCs w:val="16"/>
       </w:rPr>
-      <w:t>Version 1.4 · 20 September 2026</w:t>
+      <w:t>Version 1.5 · 20 September 2026</w:t>
     </w:r>
     <w:r>
       <w:rPr>
@@ -13999,10 +13999,154 @@
 <file path=word/numbering.xml><?xml version="1.0" encoding="utf-8"?>
 <w:numbering xmlns:wpc="http://schemas.microsoft.com/office/word/2010/wordprocessingCanvas" xmlns:cx="http://schemas.microsoft.com/office/drawing/2014/chartex" xmlns:cx1="http://schemas.microsoft.com/office/drawing/2015/9/8/chartex" xmlns:cx2="http://schemas.microsoft.com/office/drawing/2015/10/21/chartex" xmlns:cx3="http://schemas.microsoft.com/office/drawing/2016/5/9/chartex" xmlns:cx4="http://schemas.microsoft.com/office/drawing/2016/5/10/chartex" xmlns:cx5="http://schemas.microsoft.com/office/drawing/2016/5/11/chartex" xmlns:cx6="http://schemas.microsoft.com/office/drawing/2016/5/12/chartex" xmlns:cx7="http://schemas.microsoft.com/office/drawing/2016/5/13/chartex" xmlns:cx8="http://schemas.microsoft.com/office/drawing/2016/5/14/chartex" xmlns:mc="http://schemas.openxmlformats.org/markup-compatibility/2006" xmlns:aink="http://schemas.microsoft.com/office/drawing/2016/ink" xmlns:am3d="http://schemas.microsoft.com/office/drawing/2017/model3d" xmlns:o="urn:schemas-microsoft-com:office:office" xmlns:oel="http://schemas.microsoft.com/office/2019/extlst" xmlns:r="http://schemas.openxmlformats.org/officeDocument/2006/relationships" xmlns:m="http://schemas.openxmlformats.org/officeDocument/2006/math" xmlns:v="urn:schemas-microsoft-com:vml" xmlns:wp14="http://schemas.microsoft.com/office/word/2010/wordprocessingDrawing" xmlns:wp="http://schemas.openxmlformats.org/drawingml/2006/wordprocessingDrawing" xmlns:w10="urn:schemas-microsoft-com:office:word" xmlns:w="http://schemas.openxmlformats.org/wordprocessingml/2006/main" xmlns:w14="http://schemas.microsoft.com/office/word/2010/wordml" xmlns:w15="http://schemas.microsoft.com/office/word/2012/wordml" xmlns:w16cex="http://schemas.microsoft.com/office/word/2018/wordml/cex" xmlns:w16cid="http://schemas.microsoft.com/office/word/2016/wordml/cid" xmlns:w16="http://schemas.microsoft.com/office/word/2018/wordml" xmlns:w16sdtdh="http://schemas.microsoft.com/office/word/2020/wordml/sdtdatahash" xmlns:w16se="http://schemas.microsoft.com/office/word/2015/wordml/symex" xmlns:wpg="http://schemas.microsoft.com/office/word/2010/wordprocessingGroup" xmlns:wpi="http://schemas.microsoft.com/office/word/2010/wordprocessingInk" xmlns:wne="http://schemas.microsoft.com/office/word/2006/wordml" xmlns:wps="http://schemas.microsoft.com/office/word/2010/wordprocessingShape" mc:Ignorable="w14 w15 w16se w16cid w16 w16cex w16sdtdh wp14">
   <w:abstractNum w:abstractNumId="0" w15:restartNumberingAfterBreak="0">
-    <w:nsid w:val="3BFD14B4"/>
+    <w:nsid w:val="08710706"/>
     <w:multiLevelType w:val="hybridMultilevel"/>
-    <w:tmpl w:val="D09218DA"/>
-    <w:lvl w:ilvl="0" w:tplc="B9581A0A">
+    <w:tmpl w:val="66F2CE50"/>
+    <w:lvl w:ilvl="0" w:tplc="471C7D2E">
+      <w:start w:val="1"/>
+      <w:numFmt w:val="bullet"/>
+      <w:lvlText w:val="•"/>
+      <w:lvlJc w:val="left"/>
+      <w:pPr>
+        <w:ind w:left="460" w:hanging="280"/>
+      </w:pPr>
+    </w:lvl>
+    <w:lvl w:ilvl="1" w:tplc="EFDA157A">
+      <w:start w:val="1"/>
+      <w:numFmt w:val="bullet"/>
+      <w:lvlText w:val="–"/>
+      <w:lvlJc w:val="left"/>
+      <w:pPr>
+        <w:ind w:left="900" w:hanging="280"/>
+      </w:pPr>
+    </w:lvl>
+    <w:lvl w:ilvl="2" w:tplc="339064EC">
+      <w:numFmt w:val="decimal"/>
+      <w:lvlText w:val=""/>
+      <w:lvlJc w:val="left"/>
+    </w:lvl>
+    <w:lvl w:ilvl="3" w:tplc="25D481D2">
+      <w:numFmt w:val="decimal"/>
+      <w:lvlText w:val=""/>
+      <w:lvlJc w:val="left"/>
+    </w:lvl>
+    <w:lvl w:ilvl="4" w:tplc="F3161CBA">
+      <w:numFmt w:val="decimal"/>
+      <w:lvlText w:val=""/>
+      <w:lvlJc w:val="left"/>
+    </w:lvl>
+    <w:lvl w:ilvl="5" w:tplc="5C300274">
+      <w:numFmt w:val="decimal"/>
+      <w:lvlText w:val=""/>
+      <w:lvlJc w:val="left"/>
+    </w:lvl>
+    <w:lvl w:ilvl="6" w:tplc="547EEF20">
+      <w:numFmt w:val="decimal"/>
+      <w:lvlText w:val=""/>
+      <w:lvlJc w:val="left"/>
+    </w:lvl>
+    <w:lvl w:ilvl="7" w:tplc="66BE0D10">
+      <w:numFmt w:val="decimal"/>
+      <w:lvlText w:val=""/>
+      <w:lvlJc w:val="left"/>
+    </w:lvl>
+    <w:lvl w:ilvl="8" w:tplc="6A048B66">
+      <w:numFmt w:val="decimal"/>
+      <w:lvlText w:val=""/>
+      <w:lvlJc w:val="left"/>
+    </w:lvl>
+  </w:abstractNum>
+  <w:abstractNum w:abstractNumId="1" w15:restartNumberingAfterBreak="0">
+    <w:nsid w:val="0E6F603C"/>
+    <w:multiLevelType w:val="hybridMultilevel"/>
+    <w:tmpl w:val="71AE86CE"/>
+    <w:lvl w:ilvl="0" w:tplc="241CB990">
+      <w:start w:val="1"/>
+      <w:numFmt w:val="bullet"/>
+      <w:lvlText w:val="●"/>
+      <w:lvlJc w:val="left"/>
+      <w:pPr>
+        <w:ind w:left="720" w:hanging="360"/>
+      </w:pPr>
+    </w:lvl>
+    <w:lvl w:ilvl="1" w:tplc="504CE218">
+      <w:start w:val="1"/>
+      <w:numFmt w:val="bullet"/>
+      <w:lvlText w:val="○"/>
+      <w:lvlJc w:val="left"/>
+      <w:pPr>
+        <w:ind w:left="1440" w:hanging="360"/>
+      </w:pPr>
+    </w:lvl>
+    <w:lvl w:ilvl="2" w:tplc="64B6F22C">
+      <w:start w:val="1"/>
+      <w:numFmt w:val="bullet"/>
+      <w:lvlText w:val="■"/>
+      <w:lvlJc w:val="left"/>
+      <w:pPr>
+        <w:ind w:left="2160" w:hanging="360"/>
+      </w:pPr>
+    </w:lvl>
+    <w:lvl w:ilvl="3" w:tplc="192C300C">
+      <w:start w:val="1"/>
+      <w:numFmt w:val="bullet"/>
+      <w:lvlText w:val="●"/>
+      <w:lvlJc w:val="left"/>
+      <w:pPr>
+        <w:ind w:left="2880" w:hanging="360"/>
+      </w:pPr>
+    </w:lvl>
+    <w:lvl w:ilvl="4" w:tplc="8A74F716">
+      <w:start w:val="1"/>
+      <w:numFmt w:val="bullet"/>
+      <w:lvlText w:val="○"/>
+      <w:lvlJc w:val="left"/>
+      <w:pPr>
+        <w:ind w:left="3600" w:hanging="360"/>
+      </w:pPr>
+    </w:lvl>
+    <w:lvl w:ilvl="5" w:tplc="CA0CE24E">
+      <w:start w:val="1"/>
+      <w:numFmt w:val="bullet"/>
+      <w:lvlText w:val="■"/>
+      <w:lvlJc w:val="left"/>
+      <w:pPr>
+        <w:ind w:left="4320" w:hanging="360"/>
+      </w:pPr>
+    </w:lvl>
+    <w:lvl w:ilvl="6" w:tplc="60483680">
+      <w:start w:val="1"/>
+      <w:numFmt w:val="bullet"/>
+      <w:lvlText w:val="●"/>
+      <w:lvlJc w:val="left"/>
+      <w:pPr>
+        <w:ind w:left="5040" w:hanging="360"/>
+      </w:pPr>
+    </w:lvl>
+    <w:lvl w:ilvl="7" w:tplc="3F0ABE64">
+      <w:start w:val="1"/>
+      <w:numFmt w:val="bullet"/>
+      <w:lvlText w:val="●"/>
+      <w:lvlJc w:val="left"/>
+      <w:pPr>
+        <w:ind w:left="5760" w:hanging="360"/>
+      </w:pPr>
+    </w:lvl>
+    <w:lvl w:ilvl="8" w:tplc="B27A6752">
+      <w:start w:val="1"/>
+      <w:numFmt w:val="bullet"/>
+      <w:lvlText w:val="●"/>
+      <w:lvlJc w:val="left"/>
+      <w:pPr>
+        <w:ind w:left="6480" w:hanging="360"/>
+      </w:pPr>
+    </w:lvl>
+  </w:abstractNum>
+  <w:abstractNum w:abstractNumId="2" w15:restartNumberingAfterBreak="0">
+    <w:nsid w:val="273E2443"/>
+    <w:multiLevelType w:val="hybridMultilevel"/>
+    <w:tmpl w:val="C75EDFA2"/>
+    <w:lvl w:ilvl="0" w:tplc="F3A6DD06">
       <w:start w:val="1"/>
       <w:numFmt w:val="decimal"/>
       <w:lvlText w:val="%1."/>
@@ -14016,138 +14160,52 @@
         <w:color w:val="A67C27"/>
       </w:rPr>
     </w:lvl>
-    <w:lvl w:ilvl="1" w:tplc="4C1434AA">
+    <w:lvl w:ilvl="1" w:tplc="B9E4E87E">
       <w:numFmt w:val="decimal"/>
       <w:lvlText w:val=""/>
       <w:lvlJc w:val="left"/>
     </w:lvl>
-    <w:lvl w:ilvl="2" w:tplc="BDF6271E">
+    <w:lvl w:ilvl="2" w:tplc="BDF63D2E">
       <w:numFmt w:val="decimal"/>
       <w:lvlText w:val=""/>
       <w:lvlJc w:val="left"/>
     </w:lvl>
-    <w:lvl w:ilvl="3" w:tplc="3276611C">
+    <w:lvl w:ilvl="3" w:tplc="78164D0A">
       <w:numFmt w:val="decimal"/>
       <w:lvlText w:val=""/>
       <w:lvlJc w:val="left"/>
     </w:lvl>
-    <w:lvl w:ilvl="4" w:tplc="E91ED480">
+    <w:lvl w:ilvl="4" w:tplc="D1CC1D70">
       <w:numFmt w:val="decimal"/>
       <w:lvlText w:val=""/>
       <w:lvlJc w:val="left"/>
     </w:lvl>
-    <w:lvl w:ilvl="5" w:tplc="BA340990">
+    <w:lvl w:ilvl="5" w:tplc="A4A6F40E">
       <w:numFmt w:val="decimal"/>
       <w:lvlText w:val=""/>
       <w:lvlJc w:val="left"/>
     </w:lvl>
-    <w:lvl w:ilvl="6" w:tplc="2FFAEBFC">
+    <w:lvl w:ilvl="6" w:tplc="536A7866">
       <w:numFmt w:val="decimal"/>
       <w:lvlText w:val=""/>
       <w:lvlJc w:val="left"/>
     </w:lvl>
-    <w:lvl w:ilvl="7" w:tplc="9F760A42">
+    <w:lvl w:ilvl="7" w:tplc="6D889CA8">
       <w:numFmt w:val="decimal"/>
       <w:lvlText w:val=""/>
       <w:lvlJc w:val="left"/>
     </w:lvl>
-    <w:lvl w:ilvl="8" w:tplc="074C5864">
+    <w:lvl w:ilvl="8" w:tplc="6B3EC63C">
       <w:numFmt w:val="decimal"/>
       <w:lvlText w:val=""/>
       <w:lvlJc w:val="left"/>
     </w:lvl>
   </w:abstractNum>
-  <w:abstractNum w:abstractNumId="1" w15:restartNumberingAfterBreak="0">
-    <w:nsid w:val="4F134EEF"/>
+  <w:abstractNum w:abstractNumId="3" w15:restartNumberingAfterBreak="0">
+    <w:nsid w:val="4B06717D"/>
     <w:multiLevelType w:val="hybridMultilevel"/>
-    <w:tmpl w:val="EF5A160A"/>
-    <w:lvl w:ilvl="0" w:tplc="BC2203C2">
-      <w:start w:val="1"/>
-      <w:numFmt w:val="bullet"/>
-      <w:lvlText w:val="●"/>
-      <w:lvlJc w:val="left"/>
-      <w:pPr>
-        <w:ind w:left="720" w:hanging="360"/>
-      </w:pPr>
-    </w:lvl>
-    <w:lvl w:ilvl="1" w:tplc="768404CA">
-      <w:start w:val="1"/>
-      <w:numFmt w:val="bullet"/>
-      <w:lvlText w:val="○"/>
-      <w:lvlJc w:val="left"/>
-      <w:pPr>
-        <w:ind w:left="1440" w:hanging="360"/>
-      </w:pPr>
-    </w:lvl>
-    <w:lvl w:ilvl="2" w:tplc="10085FD2">
-      <w:start w:val="1"/>
-      <w:numFmt w:val="bullet"/>
-      <w:lvlText w:val="■"/>
-      <w:lvlJc w:val="left"/>
-      <w:pPr>
-        <w:ind w:left="2160" w:hanging="360"/>
-      </w:pPr>
-    </w:lvl>
-    <w:lvl w:ilvl="3" w:tplc="73FE6A2C">
-      <w:start w:val="1"/>
-      <w:numFmt w:val="bullet"/>
-      <w:lvlText w:val="●"/>
-      <w:lvlJc w:val="left"/>
-      <w:pPr>
-        <w:ind w:left="2880" w:hanging="360"/>
-      </w:pPr>
-    </w:lvl>
-    <w:lvl w:ilvl="4" w:tplc="A1164A58">
-      <w:start w:val="1"/>
-      <w:numFmt w:val="bullet"/>
-      <w:lvlText w:val="○"/>
-      <w:lvlJc w:val="left"/>
-      <w:pPr>
-        <w:ind w:left="3600" w:hanging="360"/>
-      </w:pPr>
-    </w:lvl>
-    <w:lvl w:ilvl="5" w:tplc="A2400AE0">
-      <w:start w:val="1"/>
-      <w:numFmt w:val="bullet"/>
-      <w:lvlText w:val="■"/>
-      <w:lvlJc w:val="left"/>
-      <w:pPr>
-        <w:ind w:left="4320" w:hanging="360"/>
-      </w:pPr>
-    </w:lvl>
-    <w:lvl w:ilvl="6" w:tplc="832EF180">
-      <w:start w:val="1"/>
-      <w:numFmt w:val="bullet"/>
-      <w:lvlText w:val="●"/>
-      <w:lvlJc w:val="left"/>
-      <w:pPr>
-        <w:ind w:left="5040" w:hanging="360"/>
-      </w:pPr>
-    </w:lvl>
-    <w:lvl w:ilvl="7" w:tplc="67046D02">
-      <w:start w:val="1"/>
-      <w:numFmt w:val="bullet"/>
-      <w:lvlText w:val="●"/>
-      <w:lvlJc w:val="left"/>
-      <w:pPr>
-        <w:ind w:left="5760" w:hanging="360"/>
-      </w:pPr>
-    </w:lvl>
-    <w:lvl w:ilvl="8" w:tplc="71BCA54A">
-      <w:start w:val="1"/>
-      <w:numFmt w:val="bullet"/>
-      <w:lvlText w:val="●"/>
-      <w:lvlJc w:val="left"/>
-      <w:pPr>
-        <w:ind w:left="6480" w:hanging="360"/>
-      </w:pPr>
-    </w:lvl>
-  </w:abstractNum>
-  <w:abstractNum w:abstractNumId="2" w15:restartNumberingAfterBreak="0">
-    <w:nsid w:val="63DD58D5"/>
-    <w:multiLevelType w:val="hybridMultilevel"/>
-    <w:tmpl w:val="73947B52"/>
-    <w:lvl w:ilvl="0" w:tplc="64D4B6A8">
+    <w:tmpl w:val="24B4795C"/>
+    <w:lvl w:ilvl="0" w:tplc="4EF6839A">
       <w:start w:val="1"/>
       <w:numFmt w:val="decimal"/>
       <w:lvlText w:val="%1."/>
@@ -14161,125 +14219,67 @@
         <w:color w:val="A67C27"/>
       </w:rPr>
     </w:lvl>
-    <w:lvl w:ilvl="1" w:tplc="C52CCF92">
+    <w:lvl w:ilvl="1" w:tplc="2FECD77A">
       <w:numFmt w:val="decimal"/>
       <w:lvlText w:val=""/>
       <w:lvlJc w:val="left"/>
     </w:lvl>
-    <w:lvl w:ilvl="2" w:tplc="97F28D2A">
+    <w:lvl w:ilvl="2" w:tplc="1F486DD0">
       <w:numFmt w:val="decimal"/>
       <w:lvlText w:val=""/>
       <w:lvlJc w:val="left"/>
     </w:lvl>
-    <w:lvl w:ilvl="3" w:tplc="304C41D2">
+    <w:lvl w:ilvl="3" w:tplc="4D50663E">
       <w:numFmt w:val="decimal"/>
       <w:lvlText w:val=""/>
       <w:lvlJc w:val="left"/>
     </w:lvl>
-    <w:lvl w:ilvl="4" w:tplc="8C9E2302">
+    <w:lvl w:ilvl="4" w:tplc="E5105C4E">
       <w:numFmt w:val="decimal"/>
       <w:lvlText w:val=""/>
       <w:lvlJc w:val="left"/>
     </w:lvl>
-    <w:lvl w:ilvl="5" w:tplc="7FFA1F20">
+    <w:lvl w:ilvl="5" w:tplc="93A48EE8">
       <w:numFmt w:val="decimal"/>
       <w:lvlText w:val=""/>
       <w:lvlJc w:val="left"/>
     </w:lvl>
-    <w:lvl w:ilvl="6" w:tplc="7DD012A2">
+    <w:lvl w:ilvl="6" w:tplc="D088793A">
       <w:numFmt w:val="decimal"/>
       <w:lvlText w:val=""/>
       <w:lvlJc w:val="left"/>
     </w:lvl>
-    <w:lvl w:ilvl="7" w:tplc="2EEEB100">
+    <w:lvl w:ilvl="7" w:tplc="1F72E018">
       <w:numFmt w:val="decimal"/>
       <w:lvlText w:val=""/>
       <w:lvlJc w:val="left"/>
     </w:lvl>
-    <w:lvl w:ilvl="8" w:tplc="E1143D98">
+    <w:lvl w:ilvl="8" w:tplc="8D5466F2">
       <w:numFmt w:val="decimal"/>
       <w:lvlText w:val=""/>
       <w:lvlJc w:val="left"/>
     </w:lvl>
   </w:abstractNum>
-  <w:abstractNum w:abstractNumId="3" w15:restartNumberingAfterBreak="0">
-    <w:nsid w:val="7EE02045"/>
-    <w:multiLevelType w:val="hybridMultilevel"/>
-    <w:tmpl w:val="7A7C6190"/>
-    <w:lvl w:ilvl="0" w:tplc="5AB08738">
-      <w:start w:val="1"/>
-      <w:numFmt w:val="bullet"/>
-      <w:lvlText w:val="•"/>
-      <w:lvlJc w:val="left"/>
-      <w:pPr>
-        <w:ind w:left="460" w:hanging="280"/>
-      </w:pPr>
-    </w:lvl>
-    <w:lvl w:ilvl="1" w:tplc="D03622E4">
-      <w:start w:val="1"/>
-      <w:numFmt w:val="bullet"/>
-      <w:lvlText w:val="–"/>
-      <w:lvlJc w:val="left"/>
-      <w:pPr>
-        <w:ind w:left="900" w:hanging="280"/>
-      </w:pPr>
-    </w:lvl>
-    <w:lvl w:ilvl="2" w:tplc="DE18C052">
-      <w:numFmt w:val="decimal"/>
-      <w:lvlText w:val=""/>
-      <w:lvlJc w:val="left"/>
-    </w:lvl>
-    <w:lvl w:ilvl="3" w:tplc="AFDABD34">
-      <w:numFmt w:val="decimal"/>
-      <w:lvlText w:val=""/>
-      <w:lvlJc w:val="left"/>
-    </w:lvl>
-    <w:lvl w:ilvl="4" w:tplc="2F02A990">
-      <w:numFmt w:val="decimal"/>
-      <w:lvlText w:val=""/>
-      <w:lvlJc w:val="left"/>
-    </w:lvl>
-    <w:lvl w:ilvl="5" w:tplc="85884386">
-      <w:numFmt w:val="decimal"/>
-      <w:lvlText w:val=""/>
-      <w:lvlJc w:val="left"/>
-    </w:lvl>
-    <w:lvl w:ilvl="6" w:tplc="C1EC0A8C">
-      <w:numFmt w:val="decimal"/>
-      <w:lvlText w:val=""/>
-      <w:lvlJc w:val="left"/>
-    </w:lvl>
-    <w:lvl w:ilvl="7" w:tplc="DAA0E57E">
-      <w:numFmt w:val="decimal"/>
-      <w:lvlText w:val=""/>
-      <w:lvlJc w:val="left"/>
-    </w:lvl>
-    <w:lvl w:ilvl="8" w:tplc="B8C29758">
-      <w:numFmt w:val="decimal"/>
-      <w:lvlText w:val=""/>
-      <w:lvlJc w:val="left"/>
-    </w:lvl>
-  </w:abstractNum>
-  <w:num w:numId="1" w16cid:durableId="301157910">
+  <w:num w:numId="1" w16cid:durableId="1324972939">
     <w:abstractNumId w:val="1"/>
     <w:lvlOverride w:ilvl="0">
       <w:startOverride w:val="1"/>
     </w:lvlOverride>
   </w:num>
-  <w:num w:numId="2" w16cid:durableId="1843154885">
-    <w:abstractNumId w:val="3"/>
+  <w:num w:numId="2" w16cid:durableId="486091179">
+    <w:abstractNumId w:val="0"/>
     <w:lvlOverride w:ilvl="0">
       <w:startOverride w:val="1"/>
     </w:lvlOverride>
   </w:num>
-  <w:num w:numId="3" w16cid:durableId="836650730">
+  <w:num w:numId="3" w16cid:durableId="1033384560">
     <w:abstractNumId w:val="2"/>
     <w:lvlOverride w:ilvl="0">
       <w:startOverride w:val="1"/>
     </w:lvlOverride>
   </w:num>
-  <w:num w:numId="4" w16cid:durableId="1378580123">
-    <w:abstractNumId w:val="0"/>
+  <w:num w:numId="4" w16cid:durableId="678122529">
+    <w:abstractNumId w:val="3"/>
     <w:lvlOverride w:ilvl="0">
       <w:startOverride w:val="1"/>
     </w:lvlOverride>
@@ -14904,7 +14904,7 @@
     <w:autoRedefine/>
     <w:uiPriority w:val="39"/>
     <w:unhideWhenUsed/>
-    <w:rsid w:val="00913645"/>
+    <w:rsid w:val="001B799B"/>
     <w:pPr>
       <w:spacing w:after="100"/>
     </w:pPr>
@@ -14916,7 +14916,7 @@
     <w:autoRedefine/>
     <w:uiPriority w:val="39"/>
     <w:unhideWhenUsed/>
-    <w:rsid w:val="00913645"/>
+    <w:rsid w:val="001B799B"/>
     <w:pPr>
       <w:spacing w:after="100"/>
       <w:ind w:left="210"/>

</xml_diff>